<commit_message>
IGV y totales con decimales, sin redondeo a 10 céntimos
</commit_message>
<xml_diff>
--- a/docs/manuales/Manual_Administrador.docx
+++ b/docs/manuales/Manual_Administrador.docx
@@ -2350,7 +2350,6 @@
         <w:pStyle w:val="Marcadordecaptura"/>
       </w:pPr>
       <w:r>
-        <w:lastRenderedPageBreak/>
         <w:t>[CAPTURA 3.1: Pantalla principal del administrador — menú con los grupos OPERACIÓN, INVENTARIO y GESTIÓN]</w:t>
       </w:r>
     </w:p>
@@ -2377,12 +2376,6 @@
         <w:gridCol w:w="8004"/>
       </w:tblGrid>
       <w:tr>
-        <w:tblPrEx>
-          <w:tblCellMar>
-            <w:top w:w="0" w:type="dxa"/>
-            <w:bottom w:w="0" w:type="dxa"/>
-          </w:tblCellMar>
-        </w:tblPrEx>
         <w:trPr>
           <w:cantSplit/>
           <w:tblHeader/>
@@ -2441,12 +2434,6 @@
         </w:tc>
       </w:tr>
       <w:tr>
-        <w:tblPrEx>
-          <w:tblCellMar>
-            <w:top w:w="0" w:type="dxa"/>
-            <w:bottom w:w="0" w:type="dxa"/>
-          </w:tblCellMar>
-        </w:tblPrEx>
         <w:trPr>
           <w:cantSplit/>
         </w:trPr>
@@ -2498,12 +2485,6 @@
         </w:tc>
       </w:tr>
       <w:tr>
-        <w:tblPrEx>
-          <w:tblCellMar>
-            <w:top w:w="0" w:type="dxa"/>
-            <w:bottom w:w="0" w:type="dxa"/>
-          </w:tblCellMar>
-        </w:tblPrEx>
         <w:trPr>
           <w:cantSplit/>
         </w:trPr>
@@ -2571,12 +2552,6 @@
         </w:tc>
       </w:tr>
       <w:tr>
-        <w:tblPrEx>
-          <w:tblCellMar>
-            <w:top w:w="0" w:type="dxa"/>
-            <w:bottom w:w="0" w:type="dxa"/>
-          </w:tblCellMar>
-        </w:tblPrEx>
         <w:trPr>
           <w:cantSplit/>
         </w:trPr>
@@ -2628,12 +2603,6 @@
         </w:tc>
       </w:tr>
       <w:tr>
-        <w:tblPrEx>
-          <w:tblCellMar>
-            <w:top w:w="0" w:type="dxa"/>
-            <w:bottom w:w="0" w:type="dxa"/>
-          </w:tblCellMar>
-        </w:tblPrEx>
         <w:trPr>
           <w:cantSplit/>
         </w:trPr>
@@ -2709,12 +2678,6 @@
         </w:tc>
       </w:tr>
       <w:tr>
-        <w:tblPrEx>
-          <w:tblCellMar>
-            <w:top w:w="0" w:type="dxa"/>
-            <w:bottom w:w="0" w:type="dxa"/>
-          </w:tblCellMar>
-        </w:tblPrEx>
         <w:trPr>
           <w:cantSplit/>
         </w:trPr>
@@ -2788,12 +2751,6 @@
         </w:tc>
       </w:tr>
       <w:tr>
-        <w:tblPrEx>
-          <w:tblCellMar>
-            <w:top w:w="0" w:type="dxa"/>
-            <w:bottom w:w="0" w:type="dxa"/>
-          </w:tblCellMar>
-        </w:tblPrEx>
         <w:trPr>
           <w:cantSplit/>
         </w:trPr>
@@ -2847,12 +2804,6 @@
         </w:tc>
       </w:tr>
       <w:tr>
-        <w:tblPrEx>
-          <w:tblCellMar>
-            <w:top w:w="0" w:type="dxa"/>
-            <w:bottom w:w="0" w:type="dxa"/>
-          </w:tblCellMar>
-        </w:tblPrEx>
         <w:trPr>
           <w:cantSplit/>
         </w:trPr>
@@ -2904,12 +2855,6 @@
         </w:tc>
       </w:tr>
       <w:tr>
-        <w:tblPrEx>
-          <w:tblCellMar>
-            <w:top w:w="0" w:type="dxa"/>
-            <w:bottom w:w="0" w:type="dxa"/>
-          </w:tblCellMar>
-        </w:tblPrEx>
         <w:trPr>
           <w:cantSplit/>
         </w:trPr>
@@ -3233,7 +3178,10 @@
         <w:t>Advertencia:</w:t>
       </w:r>
       <w:r>
-        <w:t xml:space="preserve"> cada usuario tiene un solo turno abierto. Los montos en efectivo no admiten céntimos sueltos de 1 o 5.</w:t>
+        <w:t xml:space="preserve"> cada usuario tiene un solo turno abierto. </w:t>
+      </w:r>
+      <w:r>
+        <w:t>Los montos en efectivo aceptan céntimos.</w:t>
       </w:r>
     </w:p>
     <w:p>
@@ -3481,7 +3429,13 @@
         <w:pStyle w:val="Marcadordecaptura"/>
       </w:pPr>
       <w:r>
-        <w:t>[CAPTURA 4.2.1: Ventas — carrito con cliente VIP y el desglose con Descuento, IGV 18%, Redondeo y TOTAL]</w:t>
+        <w:t xml:space="preserve">[CAPTURA 4.2.1: Ventas — carrito con cliente VIP y el desglose con Descuento, </w:t>
+      </w:r>
+      <w:r>
+        <w:t>IGV 18% y TOTAL</w:t>
+      </w:r>
+      <w:r>
+        <w:t>]</w:t>
       </w:r>
     </w:p>
     <w:p>
@@ -3520,27 +3474,7 @@
           <w:b/>
           <w:bCs/>
         </w:rPr>
-        <w:t>IGV 18%</w:t>
-      </w:r>
-      <w:r>
-        <w:t xml:space="preserve">, </w:t>
-      </w:r>
-      <w:r>
-        <w:rPr>
-          <w:b/>
-          <w:bCs/>
-        </w:rPr>
-        <w:t>Redondeo</w:t>
-      </w:r>
-      <w:r>
-        <w:t xml:space="preserve"> y </w:t>
-      </w:r>
-      <w:r>
-        <w:rPr>
-          <w:b/>
-          <w:bCs/>
-        </w:rPr>
-        <w:t>TOTAL</w:t>
+        <w:t>IGV 18% y TOTAL</w:t>
       </w:r>
       <w:r>
         <w:t>.</w:t>
@@ -3563,7 +3497,6 @@
           <w:b/>
           <w:bCs/>
         </w:rPr>
-        <w:lastRenderedPageBreak/>
         <w:t>Advertencia:</w:t>
       </w:r>
       <w:r>
@@ -4312,7 +4245,6 @@
       </w:pPr>
       <w:bookmarkStart w:id="11" w:name="_Toc243346849"/>
       <w:r>
-        <w:lastRenderedPageBreak/>
         <w:t>4.6 Anular una venta</w:t>
       </w:r>
       <w:bookmarkEnd w:id="11"/>
@@ -5108,7 +5040,6 @@
           <w:b/>
           <w:bCs/>
         </w:rPr>
-        <w:lastRenderedPageBreak/>
         <w:t>Resultado esperado:</w:t>
       </w:r>
       <w:r>
@@ -5925,7 +5856,6 @@
           <w:b/>
           <w:color w:val="1F3864"/>
         </w:rPr>
-        <w:lastRenderedPageBreak/>
         <w:t>2.</w:t>
       </w:r>
       <w:r>
@@ -6476,8 +6406,6 @@
       </w:r>
       <w:r>
         <w:tab/>
-      </w:r>
-      <w:r>
         <w:t xml:space="preserve">Lea los indicadores: </w:t>
       </w:r>
       <w:r>
@@ -6871,7 +6799,6 @@
           <w:b/>
           <w:bCs/>
         </w:rPr>
-        <w:lastRenderedPageBreak/>
         <w:t>Resultado esperado:</w:t>
       </w:r>
       <w:r>
@@ -7435,7 +7362,6 @@
       </w:pPr>
       <w:bookmarkStart w:id="21" w:name="_Toc243346859"/>
       <w:r>
-        <w:lastRenderedPageBreak/>
         <w:t>5. Reglas del negocio que debe conocer</w:t>
       </w:r>
       <w:bookmarkEnd w:id="21"/>
@@ -7463,12 +7389,6 @@
         <w:gridCol w:w="7706"/>
       </w:tblGrid>
       <w:tr>
-        <w:tblPrEx>
-          <w:tblCellMar>
-            <w:top w:w="0" w:type="dxa"/>
-            <w:bottom w:w="0" w:type="dxa"/>
-          </w:tblCellMar>
-        </w:tblPrEx>
         <w:trPr>
           <w:cantSplit/>
           <w:tblHeader/>
@@ -7527,12 +7447,6 @@
         </w:tc>
       </w:tr>
       <w:tr>
-        <w:tblPrEx>
-          <w:tblCellMar>
-            <w:top w:w="0" w:type="dxa"/>
-            <w:bottom w:w="0" w:type="dxa"/>
-          </w:tblCellMar>
-        </w:tblPrEx>
         <w:trPr>
           <w:cantSplit/>
         </w:trPr>
@@ -7584,12 +7498,6 @@
         </w:tc>
       </w:tr>
       <w:tr>
-        <w:tblPrEx>
-          <w:tblCellMar>
-            <w:top w:w="0" w:type="dxa"/>
-            <w:bottom w:w="0" w:type="dxa"/>
-          </w:tblCellMar>
-        </w:tblPrEx>
         <w:trPr>
           <w:cantSplit/>
         </w:trPr>
@@ -7643,12 +7551,6 @@
         </w:tc>
       </w:tr>
       <w:tr>
-        <w:tblPrEx>
-          <w:tblCellMar>
-            <w:top w:w="0" w:type="dxa"/>
-            <w:bottom w:w="0" w:type="dxa"/>
-          </w:tblCellMar>
-        </w:tblPrEx>
         <w:trPr>
           <w:cantSplit/>
         </w:trPr>
@@ -7700,12 +7602,6 @@
         </w:tc>
       </w:tr>
       <w:tr>
-        <w:tblPrEx>
-          <w:tblCellMar>
-            <w:top w:w="0" w:type="dxa"/>
-            <w:bottom w:w="0" w:type="dxa"/>
-          </w:tblCellMar>
-        </w:tblPrEx>
         <w:trPr>
           <w:cantSplit/>
         </w:trPr>
@@ -7759,12 +7655,6 @@
         </w:tc>
       </w:tr>
       <w:tr>
-        <w:tblPrEx>
-          <w:tblCellMar>
-            <w:top w:w="0" w:type="dxa"/>
-            <w:bottom w:w="0" w:type="dxa"/>
-          </w:tblCellMar>
-        </w:tblPrEx>
         <w:trPr>
           <w:cantSplit/>
         </w:trPr>
@@ -7816,12 +7706,6 @@
         </w:tc>
       </w:tr>
       <w:tr>
-        <w:tblPrEx>
-          <w:tblCellMar>
-            <w:top w:w="0" w:type="dxa"/>
-            <w:bottom w:w="0" w:type="dxa"/>
-          </w:tblCellMar>
-        </w:tblPrEx>
         <w:trPr>
           <w:cantSplit/>
         </w:trPr>
@@ -7889,12 +7773,6 @@
         </w:tc>
       </w:tr>
       <w:tr>
-        <w:tblPrEx>
-          <w:tblCellMar>
-            <w:top w:w="0" w:type="dxa"/>
-            <w:bottom w:w="0" w:type="dxa"/>
-          </w:tblCellMar>
-        </w:tblPrEx>
         <w:trPr>
           <w:cantSplit/>
         </w:trPr>
@@ -7917,7 +7795,7 @@
               <w:rPr>
                 <w:sz w:val="19"/>
               </w:rPr>
-              <w:t>IGV y redondeo</w:t>
+              <w:t>IGV</w:t>
             </w:r>
           </w:p>
         </w:tc>
@@ -7940,18 +7818,12 @@
               <w:rPr>
                 <w:sz w:val="19"/>
               </w:rPr>
-              <w:t>IGV 18 % sobre (subtotal − descuento). El total se redondea hacia abajo a 10 céntimos, a favor del cliente.</w:t>
+              <w:t>La base es (subtotal − descuento). El IGV es el 18 % de la base, con 2 decimales y sin redondeo a 10 céntimos; el total es base más IGV. El sistema no redondea el total porque el negocio debe declarar exactamente el IGV cobrado. Las ventas registradas antes de este cambio conservan su línea Redondeo en el comprobante.</w:t>
             </w:r>
           </w:p>
         </w:tc>
       </w:tr>
       <w:tr>
-        <w:tblPrEx>
-          <w:tblCellMar>
-            <w:top w:w="0" w:type="dxa"/>
-            <w:bottom w:w="0" w:type="dxa"/>
-          </w:tblCellMar>
-        </w:tblPrEx>
         <w:trPr>
           <w:cantSplit/>
         </w:trPr>
@@ -8005,12 +7877,6 @@
         </w:tc>
       </w:tr>
       <w:tr>
-        <w:tblPrEx>
-          <w:tblCellMar>
-            <w:top w:w="0" w:type="dxa"/>
-            <w:bottom w:w="0" w:type="dxa"/>
-          </w:tblCellMar>
-        </w:tblPrEx>
         <w:trPr>
           <w:cantSplit/>
         </w:trPr>
@@ -8062,12 +7928,6 @@
         </w:tc>
       </w:tr>
       <w:tr>
-        <w:tblPrEx>
-          <w:tblCellMar>
-            <w:top w:w="0" w:type="dxa"/>
-            <w:bottom w:w="0" w:type="dxa"/>
-          </w:tblCellMar>
-        </w:tblPrEx>
         <w:trPr>
           <w:cantSplit/>
         </w:trPr>
@@ -8121,12 +7981,6 @@
         </w:tc>
       </w:tr>
       <w:tr>
-        <w:tblPrEx>
-          <w:tblCellMar>
-            <w:top w:w="0" w:type="dxa"/>
-            <w:bottom w:w="0" w:type="dxa"/>
-          </w:tblCellMar>
-        </w:tblPrEx>
         <w:trPr>
           <w:cantSplit/>
         </w:trPr>
@@ -8178,12 +8032,6 @@
         </w:tc>
       </w:tr>
       <w:tr>
-        <w:tblPrEx>
-          <w:tblCellMar>
-            <w:top w:w="0" w:type="dxa"/>
-            <w:bottom w:w="0" w:type="dxa"/>
-          </w:tblCellMar>
-        </w:tblPrEx>
         <w:trPr>
           <w:cantSplit/>
         </w:trPr>
@@ -8237,12 +8085,6 @@
         </w:tc>
       </w:tr>
       <w:tr>
-        <w:tblPrEx>
-          <w:tblCellMar>
-            <w:top w:w="0" w:type="dxa"/>
-            <w:bottom w:w="0" w:type="dxa"/>
-          </w:tblCellMar>
-        </w:tblPrEx>
         <w:trPr>
           <w:cantSplit/>
         </w:trPr>
@@ -8332,12 +8174,6 @@
         <w:gridCol w:w="4949"/>
       </w:tblGrid>
       <w:tr>
-        <w:tblPrEx>
-          <w:tblCellMar>
-            <w:top w:w="0" w:type="dxa"/>
-            <w:bottom w:w="0" w:type="dxa"/>
-          </w:tblCellMar>
-        </w:tblPrEx>
         <w:trPr>
           <w:cantSplit/>
           <w:tblHeader/>
@@ -8396,12 +8232,6 @@
         </w:tc>
       </w:tr>
       <w:tr>
-        <w:tblPrEx>
-          <w:tblCellMar>
-            <w:top w:w="0" w:type="dxa"/>
-            <w:bottom w:w="0" w:type="dxa"/>
-          </w:tblCellMar>
-        </w:tblPrEx>
         <w:trPr>
           <w:cantSplit/>
         </w:trPr>
@@ -8467,12 +8297,6 @@
         </w:tc>
       </w:tr>
       <w:tr>
-        <w:tblPrEx>
-          <w:tblCellMar>
-            <w:top w:w="0" w:type="dxa"/>
-            <w:bottom w:w="0" w:type="dxa"/>
-          </w:tblCellMar>
-        </w:tblPrEx>
         <w:trPr>
           <w:cantSplit/>
         </w:trPr>
@@ -8568,12 +8392,6 @@
         </w:tc>
       </w:tr>
       <w:tr>
-        <w:tblPrEx>
-          <w:tblCellMar>
-            <w:top w:w="0" w:type="dxa"/>
-            <w:bottom w:w="0" w:type="dxa"/>
-          </w:tblCellMar>
-        </w:tblPrEx>
         <w:trPr>
           <w:cantSplit/>
         </w:trPr>
@@ -8625,12 +8443,6 @@
         </w:tc>
       </w:tr>
       <w:tr>
-        <w:tblPrEx>
-          <w:tblCellMar>
-            <w:top w:w="0" w:type="dxa"/>
-            <w:bottom w:w="0" w:type="dxa"/>
-          </w:tblCellMar>
-        </w:tblPrEx>
         <w:trPr>
           <w:cantSplit/>
         </w:trPr>
@@ -8684,12 +8496,6 @@
         </w:tc>
       </w:tr>
       <w:tr>
-        <w:tblPrEx>
-          <w:tblCellMar>
-            <w:top w:w="0" w:type="dxa"/>
-            <w:bottom w:w="0" w:type="dxa"/>
-          </w:tblCellMar>
-        </w:tblPrEx>
         <w:trPr>
           <w:cantSplit/>
         </w:trPr>
@@ -8741,12 +8547,6 @@
         </w:tc>
       </w:tr>
       <w:tr>
-        <w:tblPrEx>
-          <w:tblCellMar>
-            <w:top w:w="0" w:type="dxa"/>
-            <w:bottom w:w="0" w:type="dxa"/>
-          </w:tblCellMar>
-        </w:tblPrEx>
         <w:trPr>
           <w:cantSplit/>
         </w:trPr>
@@ -8800,12 +8600,6 @@
         </w:tc>
       </w:tr>
       <w:tr>
-        <w:tblPrEx>
-          <w:tblCellMar>
-            <w:top w:w="0" w:type="dxa"/>
-            <w:bottom w:w="0" w:type="dxa"/>
-          </w:tblCellMar>
-        </w:tblPrEx>
         <w:trPr>
           <w:cantSplit/>
         </w:trPr>
@@ -8857,12 +8651,6 @@
         </w:tc>
       </w:tr>
       <w:tr>
-        <w:tblPrEx>
-          <w:tblCellMar>
-            <w:top w:w="0" w:type="dxa"/>
-            <w:bottom w:w="0" w:type="dxa"/>
-          </w:tblCellMar>
-        </w:tblPrEx>
         <w:trPr>
           <w:cantSplit/>
         </w:trPr>
@@ -8930,12 +8718,6 @@
         </w:tc>
       </w:tr>
       <w:tr>
-        <w:tblPrEx>
-          <w:tblCellMar>
-            <w:top w:w="0" w:type="dxa"/>
-            <w:bottom w:w="0" w:type="dxa"/>
-          </w:tblCellMar>
-        </w:tblPrEx>
         <w:trPr>
           <w:cantSplit/>
         </w:trPr>
@@ -8958,7 +8740,6 @@
               <w:rPr>
                 <w:sz w:val="19"/>
               </w:rPr>
-              <w:lastRenderedPageBreak/>
               <w:t>El personal puede aplicar como máximo 10 % de descuento manual. …</w:t>
             </w:r>
           </w:p>
@@ -8988,12 +8769,6 @@
         </w:tc>
       </w:tr>
       <w:tr>
-        <w:tblPrEx>
-          <w:tblCellMar>
-            <w:top w:w="0" w:type="dxa"/>
-            <w:bottom w:w="0" w:type="dxa"/>
-          </w:tblCellMar>
-        </w:tblPrEx>
         <w:trPr>
           <w:cantSplit/>
         </w:trPr>
@@ -9047,12 +8822,6 @@
         </w:tc>
       </w:tr>
       <w:tr>
-        <w:tblPrEx>
-          <w:tblCellMar>
-            <w:top w:w="0" w:type="dxa"/>
-            <w:bottom w:w="0" w:type="dxa"/>
-          </w:tblCellMar>
-        </w:tblPrEx>
         <w:trPr>
           <w:cantSplit/>
         </w:trPr>
@@ -9104,12 +8873,6 @@
         </w:tc>
       </w:tr>
       <w:tr>
-        <w:tblPrEx>
-          <w:tblCellMar>
-            <w:top w:w="0" w:type="dxa"/>
-            <w:bottom w:w="0" w:type="dxa"/>
-          </w:tblCellMar>
-        </w:tblPrEx>
         <w:trPr>
           <w:cantSplit/>
         </w:trPr>
@@ -9163,12 +8926,6 @@
         </w:tc>
       </w:tr>
       <w:tr>
-        <w:tblPrEx>
-          <w:tblCellMar>
-            <w:top w:w="0" w:type="dxa"/>
-            <w:bottom w:w="0" w:type="dxa"/>
-          </w:tblCellMar>
-        </w:tblPrEx>
         <w:trPr>
           <w:cantSplit/>
         </w:trPr>
@@ -9234,12 +8991,6 @@
         </w:tc>
       </w:tr>
       <w:tr>
-        <w:tblPrEx>
-          <w:tblCellMar>
-            <w:top w:w="0" w:type="dxa"/>
-            <w:bottom w:w="0" w:type="dxa"/>
-          </w:tblCellMar>
-        </w:tblPrEx>
         <w:trPr>
           <w:cantSplit/>
         </w:trPr>
@@ -9554,12 +9305,6 @@
         <w:gridCol w:w="2831"/>
       </w:tblGrid>
       <w:tr>
-        <w:tblPrEx>
-          <w:tblCellMar>
-            <w:top w:w="0" w:type="dxa"/>
-            <w:bottom w:w="0" w:type="dxa"/>
-          </w:tblCellMar>
-        </w:tblPrEx>
         <w:trPr>
           <w:cantSplit/>
           <w:tblHeader/>
@@ -9670,12 +9415,6 @@
         </w:tc>
       </w:tr>
       <w:tr>
-        <w:tblPrEx>
-          <w:tblCellMar>
-            <w:top w:w="0" w:type="dxa"/>
-            <w:bottom w:w="0" w:type="dxa"/>
-          </w:tblCellMar>
-        </w:tblPrEx>
         <w:trPr>
           <w:cantSplit/>
         </w:trPr>
@@ -9773,12 +9512,6 @@
         </w:tc>
       </w:tr>
       <w:tr>
-        <w:tblPrEx>
-          <w:tblCellMar>
-            <w:top w:w="0" w:type="dxa"/>
-            <w:bottom w:w="0" w:type="dxa"/>
-          </w:tblCellMar>
-        </w:tblPrEx>
         <w:trPr>
           <w:cantSplit/>
         </w:trPr>
@@ -9880,12 +9613,6 @@
         </w:tc>
       </w:tr>
       <w:tr>
-        <w:tblPrEx>
-          <w:tblCellMar>
-            <w:top w:w="0" w:type="dxa"/>
-            <w:bottom w:w="0" w:type="dxa"/>
-          </w:tblCellMar>
-        </w:tblPrEx>
         <w:trPr>
           <w:cantSplit/>
         </w:trPr>
@@ -9983,12 +9710,6 @@
         </w:tc>
       </w:tr>
       <w:tr>
-        <w:tblPrEx>
-          <w:tblCellMar>
-            <w:top w:w="0" w:type="dxa"/>
-            <w:bottom w:w="0" w:type="dxa"/>
-          </w:tblCellMar>
-        </w:tblPrEx>
         <w:trPr>
           <w:cantSplit/>
         </w:trPr>
@@ -10060,7 +9781,13 @@
               <w:rPr>
                 <w:sz w:val="19"/>
               </w:rPr>
-              <w:t>Carrito con cliente VIP y el desglose con Descuento, IGV 18%, Redondeo y TOTAL</w:t>
+              <w:t xml:space="preserve">Carrito con cliente VIP y el desglose con Descuento, </w:t>
+            </w:r>
+            <w:r>
+              <w:rPr>
+                <w:sz w:val="19"/>
+              </w:rPr>
+              <w:t>IGV 18% y TOTAL</w:t>
             </w:r>
           </w:p>
         </w:tc>
@@ -10090,12 +9817,6 @@
         </w:tc>
       </w:tr>
       <w:tr>
-        <w:tblPrEx>
-          <w:tblCellMar>
-            <w:top w:w="0" w:type="dxa"/>
-            <w:bottom w:w="0" w:type="dxa"/>
-          </w:tblCellMar>
-        </w:tblPrEx>
         <w:trPr>
           <w:cantSplit/>
         </w:trPr>
@@ -10193,12 +9914,6 @@
         </w:tc>
       </w:tr>
       <w:tr>
-        <w:tblPrEx>
-          <w:tblCellMar>
-            <w:top w:w="0" w:type="dxa"/>
-            <w:bottom w:w="0" w:type="dxa"/>
-          </w:tblCellMar>
-        </w:tblPrEx>
         <w:trPr>
           <w:cantSplit/>
         </w:trPr>
@@ -10222,7 +9937,6 @@
               <w:rPr>
                 <w:sz w:val="19"/>
               </w:rPr>
-              <w:lastRenderedPageBreak/>
               <w:t>4.5.1</w:t>
             </w:r>
           </w:p>
@@ -10301,12 +10015,6 @@
         </w:tc>
       </w:tr>
       <w:tr>
-        <w:tblPrEx>
-          <w:tblCellMar>
-            <w:top w:w="0" w:type="dxa"/>
-            <w:bottom w:w="0" w:type="dxa"/>
-          </w:tblCellMar>
-        </w:tblPrEx>
         <w:trPr>
           <w:cantSplit/>
         </w:trPr>
@@ -10404,12 +10112,6 @@
         </w:tc>
       </w:tr>
       <w:tr>
-        <w:tblPrEx>
-          <w:tblCellMar>
-            <w:top w:w="0" w:type="dxa"/>
-            <w:bottom w:w="0" w:type="dxa"/>
-          </w:tblCellMar>
-        </w:tblPrEx>
         <w:trPr>
           <w:cantSplit/>
         </w:trPr>
@@ -10511,12 +10213,6 @@
         </w:tc>
       </w:tr>
       <w:tr>
-        <w:tblPrEx>
-          <w:tblCellMar>
-            <w:top w:w="0" w:type="dxa"/>
-            <w:bottom w:w="0" w:type="dxa"/>
-          </w:tblCellMar>
-        </w:tblPrEx>
         <w:trPr>
           <w:cantSplit/>
         </w:trPr>
@@ -10614,12 +10310,6 @@
         </w:tc>
       </w:tr>
       <w:tr>
-        <w:tblPrEx>
-          <w:tblCellMar>
-            <w:top w:w="0" w:type="dxa"/>
-            <w:bottom w:w="0" w:type="dxa"/>
-          </w:tblCellMar>
-        </w:tblPrEx>
         <w:trPr>
           <w:cantSplit/>
         </w:trPr>
@@ -10721,12 +10411,6 @@
         </w:tc>
       </w:tr>
       <w:tr>
-        <w:tblPrEx>
-          <w:tblCellMar>
-            <w:top w:w="0" w:type="dxa"/>
-            <w:bottom w:w="0" w:type="dxa"/>
-          </w:tblCellMar>
-        </w:tblPrEx>
         <w:trPr>
           <w:cantSplit/>
         </w:trPr>
@@ -10824,12 +10508,6 @@
         </w:tc>
       </w:tr>
       <w:tr>
-        <w:tblPrEx>
-          <w:tblCellMar>
-            <w:top w:w="0" w:type="dxa"/>
-            <w:bottom w:w="0" w:type="dxa"/>
-          </w:tblCellMar>
-        </w:tblPrEx>
         <w:trPr>
           <w:cantSplit/>
         </w:trPr>
@@ -10931,12 +10609,6 @@
         </w:tc>
       </w:tr>
       <w:tr>
-        <w:tblPrEx>
-          <w:tblCellMar>
-            <w:top w:w="0" w:type="dxa"/>
-            <w:bottom w:w="0" w:type="dxa"/>
-          </w:tblCellMar>
-        </w:tblPrEx>
         <w:trPr>
           <w:cantSplit/>
         </w:trPr>
@@ -11034,12 +10706,6 @@
         </w:tc>
       </w:tr>
       <w:tr>
-        <w:tblPrEx>
-          <w:tblCellMar>
-            <w:top w:w="0" w:type="dxa"/>
-            <w:bottom w:w="0" w:type="dxa"/>
-          </w:tblCellMar>
-        </w:tblPrEx>
         <w:trPr>
           <w:cantSplit/>
         </w:trPr>
@@ -11141,12 +10807,6 @@
         </w:tc>
       </w:tr>
       <w:tr>
-        <w:tblPrEx>
-          <w:tblCellMar>
-            <w:top w:w="0" w:type="dxa"/>
-            <w:bottom w:w="0" w:type="dxa"/>
-          </w:tblCellMar>
-        </w:tblPrEx>
         <w:trPr>
           <w:cantSplit/>
         </w:trPr>
@@ -11244,12 +10904,6 @@
         </w:tc>
       </w:tr>
       <w:tr>
-        <w:tblPrEx>
-          <w:tblCellMar>
-            <w:top w:w="0" w:type="dxa"/>
-            <w:bottom w:w="0" w:type="dxa"/>
-          </w:tblCellMar>
-        </w:tblPrEx>
         <w:trPr>
           <w:cantSplit/>
         </w:trPr>

</xml_diff>

<commit_message>
El personal puede anular ventas de su turno, con registro del motivo
</commit_message>
<xml_diff>
--- a/docs/manuales/Manual_Administrador.docx
+++ b/docs/manuales/Manual_Administrador.docx
@@ -1887,7 +1887,13 @@
         <w:t>administrador</w:t>
       </w:r>
       <w:r>
-        <w:t>. El administrador hace todo lo que hace el personal de tienda y, además, autoriza mermas y órdenes de compra, anula ventas, gestiona los productos, las cuentas de usuario, los datos del negocio y los reportes, y respalda la base de datos. Las tareas que comparte con el personal se explican aquí de forma resumida; el detalle para la caja está en el Manual del Personal de Tienda.</w:t>
+        <w:t xml:space="preserve">. El administrador hace todo lo que hace el personal de tienda y, además, autoriza mermas y órdenes de compra, </w:t>
+      </w:r>
+      <w:r>
+        <w:t>anula cualquier venta de un turno abierto (el personal solo anula las de su propio turno), revisa el registro de anulaciones, gestiona</w:t>
+      </w:r>
+      <w:r>
+        <w:t xml:space="preserve"> los productos, las cuentas de usuario, los datos del negocio y los reportes, y respalda la base de datos. Las tareas que comparte con el personal se explican aquí de forma resumida; el detalle para la caja está en el Manual del Personal de Tienda.</w:t>
       </w:r>
     </w:p>
     <w:p>
@@ -2479,7 +2485,7 @@
               <w:rPr>
                 <w:sz w:val="19"/>
               </w:rPr>
-              <w:t>Ver el historial de turnos de todos, cerrar el turno de otro usuario y anular ventas.</w:t>
+              <w:t>Ver el historial de turnos de todos, cerrar el turno de otro usuario, anular cualquier venta de un turno abierto y ver el registro de anulaciones de todos los usuarios.</w:t>
             </w:r>
           </w:p>
         </w:tc>
@@ -4268,7 +4274,10 @@
         <w:t>Cuándo se usa:</w:t>
       </w:r>
       <w:r>
-        <w:t xml:space="preserve"> solo mientras el turno de esa venta siga abierto.</w:t>
+        <w:t xml:space="preserve"> </w:t>
+      </w:r>
+      <w:r>
+        <w:t>solo mientras el turno de esa venta siga abierto. El administrador anula cualquier venta de un turno abierto; el personal, solo las que registró en su propio turno abierto.</w:t>
       </w:r>
     </w:p>
     <w:p>
@@ -4375,22 +4384,57 @@
       </w:r>
       <w:r>
         <w:tab/>
-        <w:t xml:space="preserve">Lea el aviso, escriba el </w:t>
-      </w:r>
-      <w:r>
-        <w:rPr>
-          <w:b/>
-          <w:bCs/>
+        <w:t xml:space="preserve">Lea el aviso y elija el </w:t>
+      </w:r>
+      <w:r>
+        <w:rPr>
+          <w:b/>
         </w:rPr>
         <w:t>Motivo de la anulación</w:t>
       </w:r>
       <w:r>
-        <w:t xml:space="preserve"> y pulse </w:t>
-      </w:r>
-      <w:r>
-        <w:rPr>
-          <w:b/>
-          <w:bCs/>
+        <w:t>: Error de registro, Cliente desistió, Producto equivocado, Error en el cobro u Otro.</w:t>
+      </w:r>
+    </w:p>
+    <w:p>
+      <w:pPr>
+        <w:pStyle w:val="Pasonumerado"/>
+        <w:tabs>
+          <w:tab w:val="left" w:pos="720"/>
+        </w:tabs>
+      </w:pPr>
+      <w:r>
+        <w:rPr>
+          <w:b/>
+          <w:color w:val="1F3864"/>
+        </w:rPr>
+        <w:t>4.</w:t>
+      </w:r>
+      <w:r>
+        <w:tab/>
+        <w:t xml:space="preserve">Escriba el </w:t>
+      </w:r>
+      <w:r>
+        <w:rPr>
+          <w:b/>
+        </w:rPr>
+        <w:t>Detalle</w:t>
+      </w:r>
+      <w:r>
+        <w:t xml:space="preserve"> (opcional; con </w:t>
+      </w:r>
+      <w:r>
+        <w:rPr>
+          <w:b/>
+        </w:rPr>
+        <w:t>Otro</w:t>
+      </w:r>
+      <w:r>
+        <w:t xml:space="preserve"> es obligatorio, mínimo 5 caracteres) y pulse </w:t>
+      </w:r>
+      <w:r>
+        <w:rPr>
+          <w:b/>
         </w:rPr>
         <w:t>Aceptar</w:t>
       </w:r>
@@ -4403,7 +4447,7 @@
         <w:pStyle w:val="Marcadordecaptura"/>
       </w:pPr>
       <w:r>
-        <w:t>[CAPTURA 4.6.1: Caja — ventana "Anular venta" con el motivo de la anulación]</w:t>
+        <w:t>[CAPTURA 4.6.1: Caja — ventana "Anular venta" con la lista de motivos y el detalle]</w:t>
       </w:r>
     </w:p>
     <w:p>
@@ -4462,10 +4506,85 @@
       </w:r>
     </w:p>
     <w:p>
+      <w:bookmarkStart w:id="12" w:name="_Toc243346850"/>
+      <w:r>
+        <w:rPr>
+          <w:b/>
+          <w:bCs/>
+        </w:rPr>
+        <w:t>Registro de anulaciones.</w:t>
+      </w:r>
+      <w:r>
+        <w:rPr>
+          <w:bCs/>
+        </w:rPr>
+        <w:t xml:space="preserve"> Cada anulación, la haga el administrador o el personal, queda registrada en </w:t>
+      </w:r>
+      <w:r>
+        <w:rPr>
+          <w:b/>
+          <w:bCs/>
+        </w:rPr>
+        <w:t>Caja</w:t>
+      </w:r>
+      <w:r>
+        <w:rPr>
+          <w:bCs/>
+        </w:rPr>
+        <w:t xml:space="preserve"> → </w:t>
+      </w:r>
+      <w:r>
+        <w:rPr>
+          <w:b/>
+          <w:bCs/>
+        </w:rPr>
+        <w:t>Anulaciones</w:t>
+      </w:r>
+      <w:r>
+        <w:rPr>
+          <w:bCs/>
+        </w:rPr>
+        <w:t xml:space="preserve">: fecha y hora, venta, comprobante, usuario, rol, motivo, detalle, forma de pago y monto. Como administrador ve las de todos los usuarios; elija el rango en </w:t>
+      </w:r>
+      <w:r>
+        <w:rPr>
+          <w:b/>
+          <w:bCs/>
+        </w:rPr>
+        <w:t>Período</w:t>
+      </w:r>
+      <w:r>
+        <w:rPr>
+          <w:bCs/>
+        </w:rPr>
+        <w:t xml:space="preserve"> (Hoy, Últimos 7 días, Últimos 30 días o Este año). Arriba se muestran el número de ventas anuladas y el monto anulado del período. Las ventas anuladas antes de existir el registro no aparecen en esta pestaña, pero su comprobante sigue mostrando </w:t>
+      </w:r>
+      <w:r>
+        <w:rPr>
+          <w:b/>
+          <w:bCs/>
+        </w:rPr>
+        <w:t>ANULADO</w:t>
+      </w:r>
+      <w:r>
+        <w:rPr>
+          <w:bCs/>
+        </w:rPr>
+        <w:t xml:space="preserve"> y el motivo.</w:t>
+      </w:r>
+    </w:p>
+    <w:p>
+      <w:pPr>
+        <w:pStyle w:val="Marcadordecaptura"/>
+      </w:pPr>
+      <w:r>
+        <w:t>[CAPTURA 4.6.2: Caja, pestaña Anulaciones — registro de todos los usuarios con el filtro Período]</w:t>
+      </w:r>
+    </w:p>
+    <w:p>
       <w:pPr>
         <w:pStyle w:val="Ttulo2"/>
       </w:pPr>
-      <w:bookmarkStart w:id="12" w:name="_Toc243346850"/>
       <w:r>
         <w:t>4.7 Gestionar usuarios y roles</w:t>
       </w:r>
@@ -7975,7 +8094,46 @@
               <w:rPr>
                 <w:sz w:val="19"/>
               </w:rPr>
-              <w:t>Solo el administrador, y solo con el turno abierto. El stock vuelve a los mismos lotes. El pago con Yape o Plin se devuelve desde el celular del negocio.</w:t>
+              <w:t xml:space="preserve">Solo con el turno de la venta abierto. El administrador anula cualquier venta de un turno abierto; el personal, solo las que registró en su propio turno abierto. Motivo obligatorio de la lista (con </w:t>
+            </w:r>
+            <w:r>
+              <w:rPr>
+                <w:b/>
+                <w:sz w:val="19"/>
+              </w:rPr>
+              <w:t>Otro</w:t>
+            </w:r>
+            <w:r>
+              <w:rPr>
+                <w:sz w:val="19"/>
+              </w:rPr>
+              <w:t xml:space="preserve">, detalle de al menos 5 caracteres). Cada anulación queda en </w:t>
+            </w:r>
+            <w:r>
+              <w:rPr>
+                <w:b/>
+                <w:sz w:val="19"/>
+              </w:rPr>
+              <w:t>Caja</w:t>
+            </w:r>
+            <w:r>
+              <w:rPr>
+                <w:sz w:val="19"/>
+              </w:rPr>
+              <w:t xml:space="preserve"> → </w:t>
+            </w:r>
+            <w:r>
+              <w:rPr>
+                <w:b/>
+                <w:sz w:val="19"/>
+              </w:rPr>
+              <w:t>Anulaciones</w:t>
+            </w:r>
+            <w:r>
+              <w:rPr>
+                <w:sz w:val="19"/>
+              </w:rPr>
+              <w:t>. El stock vuelve a los mismos lotes. El pago con Yape o Plin se devuelve desde el celular del negocio.</w:t>
             </w:r>
           </w:p>
         </w:tc>
@@ -8181,6 +8339,9 @@
         <w:tc>
           <w:tcPr>
             <w:tcW w:w="4791" w:type="dxa"/>
+            <w:tcBorders>
+              <w:bottom w:val="single" w:sz="4" w:space="0" w:color="A6A6A6"/>
+            </w:tcBorders>
             <w:shd w:val="clear" w:color="auto" w:fill="1F3864"/>
             <w:tcMar>
               <w:top w:w="50" w:type="dxa"/>
@@ -8207,6 +8368,9 @@
         <w:tc>
           <w:tcPr>
             <w:tcW w:w="4949" w:type="dxa"/>
+            <w:tcBorders>
+              <w:bottom w:val="single" w:sz="4" w:space="0" w:color="A6A6A6"/>
+            </w:tcBorders>
             <w:shd w:val="clear" w:color="auto" w:fill="1F3864"/>
             <w:tcMar>
               <w:top w:w="50" w:type="dxa"/>
@@ -8238,6 +8402,10 @@
         <w:tc>
           <w:tcPr>
             <w:tcW w:w="4791" w:type="dxa"/>
+            <w:tcBorders>
+              <w:bottom w:val="single" w:sz="4" w:space="0" w:color="A6A6A6"/>
+            </w:tcBorders>
+            <w:shd w:val="clear" w:color="auto" w:fill="auto"/>
             <w:tcMar>
               <w:top w:w="50" w:type="dxa"/>
               <w:left w:w="90" w:type="dxa"/>
@@ -8261,6 +8429,10 @@
         <w:tc>
           <w:tcPr>
             <w:tcW w:w="4949" w:type="dxa"/>
+            <w:tcBorders>
+              <w:bottom w:val="single" w:sz="4" w:space="0" w:color="A6A6A6"/>
+            </w:tcBorders>
+            <w:shd w:val="clear" w:color="auto" w:fill="auto"/>
             <w:tcMar>
               <w:top w:w="50" w:type="dxa"/>
               <w:left w:w="90" w:type="dxa"/>
@@ -8303,6 +8475,9 @@
         <w:tc>
           <w:tcPr>
             <w:tcW w:w="4791" w:type="dxa"/>
+            <w:tcBorders>
+              <w:bottom w:val="single" w:sz="4" w:space="0" w:color="A6A6A6"/>
+            </w:tcBorders>
             <w:shd w:val="clear" w:color="auto" w:fill="F2F2F2"/>
             <w:tcMar>
               <w:top w:w="50" w:type="dxa"/>
@@ -8327,6 +8502,9 @@
         <w:tc>
           <w:tcPr>
             <w:tcW w:w="4949" w:type="dxa"/>
+            <w:tcBorders>
+              <w:bottom w:val="single" w:sz="4" w:space="0" w:color="A6A6A6"/>
+            </w:tcBorders>
             <w:shd w:val="clear" w:color="auto" w:fill="F2F2F2"/>
             <w:tcMar>
               <w:top w:w="50" w:type="dxa"/>
@@ -8398,6 +8576,10 @@
         <w:tc>
           <w:tcPr>
             <w:tcW w:w="4791" w:type="dxa"/>
+            <w:tcBorders>
+              <w:bottom w:val="single" w:sz="4" w:space="0" w:color="A6A6A6"/>
+            </w:tcBorders>
+            <w:shd w:val="clear" w:color="auto" w:fill="auto"/>
             <w:tcMar>
               <w:top w:w="50" w:type="dxa"/>
               <w:left w:w="90" w:type="dxa"/>
@@ -8421,6 +8603,10 @@
         <w:tc>
           <w:tcPr>
             <w:tcW w:w="4949" w:type="dxa"/>
+            <w:tcBorders>
+              <w:bottom w:val="single" w:sz="4" w:space="0" w:color="A6A6A6"/>
+            </w:tcBorders>
+            <w:shd w:val="clear" w:color="auto" w:fill="auto"/>
             <w:tcMar>
               <w:top w:w="50" w:type="dxa"/>
               <w:left w:w="90" w:type="dxa"/>
@@ -8449,6 +8635,9 @@
         <w:tc>
           <w:tcPr>
             <w:tcW w:w="4791" w:type="dxa"/>
+            <w:tcBorders>
+              <w:bottom w:val="single" w:sz="4" w:space="0" w:color="A6A6A6"/>
+            </w:tcBorders>
             <w:shd w:val="clear" w:color="auto" w:fill="F2F2F2"/>
             <w:tcMar>
               <w:top w:w="50" w:type="dxa"/>
@@ -8461,18 +8650,24 @@
             <w:pPr>
               <w:spacing w:after="0" w:line="250" w:lineRule="auto"/>
               <w:jc w:val="left"/>
-            </w:pPr>
-            <w:r>
-              <w:rPr>
-                <w:sz w:val="19"/>
-              </w:rPr>
-              <w:t>No puede desactivarse ni quitarse el rol de administrador a sí mismo.</w:t>
+              <w:rPr>
+                <w:sz w:val="19"/>
+              </w:rPr>
+            </w:pPr>
+            <w:r>
+              <w:rPr>
+                <w:sz w:val="19"/>
+              </w:rPr>
+              <w:t>Solo puede anular las ventas que usted registró en su propio turno de caja.</w:t>
             </w:r>
           </w:p>
         </w:tc>
         <w:tc>
           <w:tcPr>
             <w:tcW w:w="4949" w:type="dxa"/>
+            <w:tcBorders>
+              <w:bottom w:val="single" w:sz="4" w:space="0" w:color="A6A6A6"/>
+            </w:tcBorders>
             <w:shd w:val="clear" w:color="auto" w:fill="F2F2F2"/>
             <w:tcMar>
               <w:top w:w="50" w:type="dxa"/>
@@ -8485,12 +8680,15 @@
             <w:pPr>
               <w:spacing w:after="0" w:line="250" w:lineRule="auto"/>
               <w:jc w:val="left"/>
-            </w:pPr>
-            <w:r>
-              <w:rPr>
-                <w:sz w:val="19"/>
-              </w:rPr>
-              <w:t>Pida a otro administrador que haga el cambio.</w:t>
+              <w:rPr>
+                <w:sz w:val="19"/>
+              </w:rPr>
+            </w:pPr>
+            <w:r>
+              <w:rPr>
+                <w:sz w:val="19"/>
+              </w:rPr>
+              <w:t>Lo ve el personal que intenta anular una venta ajena. Anúlela usted si corresponde.</w:t>
             </w:r>
           </w:p>
         </w:tc>
@@ -8502,46 +8700,73 @@
         <w:tc>
           <w:tcPr>
             <w:tcW w:w="4791" w:type="dxa"/>
-            <w:tcMar>
-              <w:top w:w="50" w:type="dxa"/>
-              <w:left w:w="90" w:type="dxa"/>
-              <w:bottom w:w="50" w:type="dxa"/>
-              <w:right w:w="90" w:type="dxa"/>
-            </w:tcMar>
-          </w:tcPr>
-          <w:p>
-            <w:pPr>
-              <w:spacing w:after="0" w:line="250" w:lineRule="auto"/>
-              <w:jc w:val="left"/>
-            </w:pPr>
-            <w:r>
-              <w:rPr>
-                <w:sz w:val="19"/>
-              </w:rPr>
-              <w:t>Debe quedar al menos un administrador activo.</w:t>
+            <w:tcBorders>
+              <w:bottom w:val="single" w:sz="4" w:space="0" w:color="A6A6A6"/>
+            </w:tcBorders>
+            <w:shd w:val="clear" w:color="auto" w:fill="auto"/>
+            <w:tcMar>
+              <w:top w:w="50" w:type="dxa"/>
+              <w:left w:w="90" w:type="dxa"/>
+              <w:bottom w:w="50" w:type="dxa"/>
+              <w:right w:w="90" w:type="dxa"/>
+            </w:tcMar>
+          </w:tcPr>
+          <w:p>
+            <w:pPr>
+              <w:spacing w:after="0" w:line="250" w:lineRule="auto"/>
+              <w:jc w:val="left"/>
+              <w:rPr>
+                <w:sz w:val="19"/>
+              </w:rPr>
+            </w:pPr>
+            <w:r>
+              <w:rPr>
+                <w:sz w:val="19"/>
+              </w:rPr>
+              <w:t>Con el motivo "Otro", escriba el detalle (mínimo 5 caracteres).</w:t>
             </w:r>
           </w:p>
         </w:tc>
         <w:tc>
           <w:tcPr>
             <w:tcW w:w="4949" w:type="dxa"/>
-            <w:tcMar>
-              <w:top w:w="50" w:type="dxa"/>
-              <w:left w:w="90" w:type="dxa"/>
-              <w:bottom w:w="50" w:type="dxa"/>
-              <w:right w:w="90" w:type="dxa"/>
-            </w:tcMar>
-          </w:tcPr>
-          <w:p>
-            <w:pPr>
-              <w:spacing w:after="0" w:line="250" w:lineRule="auto"/>
-              <w:jc w:val="left"/>
-            </w:pPr>
-            <w:r>
-              <w:rPr>
-                <w:sz w:val="19"/>
-              </w:rPr>
-              <w:t>Cree o active otro administrador antes.</w:t>
+            <w:tcBorders>
+              <w:bottom w:val="single" w:sz="4" w:space="0" w:color="A6A6A6"/>
+            </w:tcBorders>
+            <w:shd w:val="clear" w:color="auto" w:fill="auto"/>
+            <w:tcMar>
+              <w:top w:w="50" w:type="dxa"/>
+              <w:left w:w="90" w:type="dxa"/>
+              <w:bottom w:w="50" w:type="dxa"/>
+              <w:right w:w="90" w:type="dxa"/>
+            </w:tcMar>
+          </w:tcPr>
+          <w:p>
+            <w:pPr>
+              <w:spacing w:after="0" w:line="250" w:lineRule="auto"/>
+              <w:jc w:val="left"/>
+              <w:rPr>
+                <w:sz w:val="19"/>
+              </w:rPr>
+            </w:pPr>
+            <w:r>
+              <w:rPr>
+                <w:sz w:val="19"/>
+              </w:rPr>
+              <w:t xml:space="preserve">Explique el caso en </w:t>
+            </w:r>
+            <w:r>
+              <w:rPr>
+                <w:b/>
+                <w:sz w:val="19"/>
+              </w:rPr>
+              <w:t>Detalle</w:t>
+            </w:r>
+            <w:r>
+              <w:rPr>
+                <w:sz w:val="19"/>
+              </w:rPr>
+              <w:t xml:space="preserve"> o elija otro motivo de la lista.</w:t>
             </w:r>
           </w:p>
         </w:tc>
@@ -8553,6 +8778,9 @@
         <w:tc>
           <w:tcPr>
             <w:tcW w:w="4791" w:type="dxa"/>
+            <w:tcBorders>
+              <w:bottom w:val="single" w:sz="4" w:space="0" w:color="A6A6A6"/>
+            </w:tcBorders>
             <w:shd w:val="clear" w:color="auto" w:fill="F2F2F2"/>
             <w:tcMar>
               <w:top w:w="50" w:type="dxa"/>
@@ -8570,13 +8798,16 @@
               <w:rPr>
                 <w:sz w:val="19"/>
               </w:rPr>
-              <w:t>Ya existe un producto con ese código.</w:t>
+              <w:t>No puede desactivarse ni quitarse el rol de administrador a sí mismo.</w:t>
             </w:r>
           </w:p>
         </w:tc>
         <w:tc>
           <w:tcPr>
             <w:tcW w:w="4949" w:type="dxa"/>
+            <w:tcBorders>
+              <w:bottom w:val="single" w:sz="4" w:space="0" w:color="A6A6A6"/>
+            </w:tcBorders>
             <w:shd w:val="clear" w:color="auto" w:fill="F2F2F2"/>
             <w:tcMar>
               <w:top w:w="50" w:type="dxa"/>
@@ -8594,7 +8825,7 @@
               <w:rPr>
                 <w:sz w:val="19"/>
               </w:rPr>
-              <w:t>Use otro código o edite el producto existente.</w:t>
+              <w:t>Pida a otro administrador que haga el cambio.</w:t>
             </w:r>
           </w:p>
         </w:tc>
@@ -8606,46 +8837,54 @@
         <w:tc>
           <w:tcPr>
             <w:tcW w:w="4791" w:type="dxa"/>
-            <w:tcMar>
-              <w:top w:w="50" w:type="dxa"/>
-              <w:left w:w="90" w:type="dxa"/>
-              <w:bottom w:w="50" w:type="dxa"/>
-              <w:right w:w="90" w:type="dxa"/>
-            </w:tcMar>
-          </w:tcPr>
-          <w:p>
-            <w:pPr>
-              <w:spacing w:after="0" w:line="250" w:lineRule="auto"/>
-              <w:jc w:val="left"/>
-            </w:pPr>
-            <w:r>
-              <w:rPr>
-                <w:sz w:val="19"/>
-              </w:rPr>
-              <w:t>El stock máximo debe ser mayor que el mínimo.</w:t>
+            <w:tcBorders>
+              <w:bottom w:val="single" w:sz="4" w:space="0" w:color="A6A6A6"/>
+            </w:tcBorders>
+            <w:shd w:val="clear" w:color="auto" w:fill="auto"/>
+            <w:tcMar>
+              <w:top w:w="50" w:type="dxa"/>
+              <w:left w:w="90" w:type="dxa"/>
+              <w:bottom w:w="50" w:type="dxa"/>
+              <w:right w:w="90" w:type="dxa"/>
+            </w:tcMar>
+          </w:tcPr>
+          <w:p>
+            <w:pPr>
+              <w:spacing w:after="0" w:line="250" w:lineRule="auto"/>
+              <w:jc w:val="left"/>
+            </w:pPr>
+            <w:r>
+              <w:rPr>
+                <w:sz w:val="19"/>
+              </w:rPr>
+              <w:t>Debe quedar al menos un administrador activo.</w:t>
             </w:r>
           </w:p>
         </w:tc>
         <w:tc>
           <w:tcPr>
             <w:tcW w:w="4949" w:type="dxa"/>
-            <w:tcMar>
-              <w:top w:w="50" w:type="dxa"/>
-              <w:left w:w="90" w:type="dxa"/>
-              <w:bottom w:w="50" w:type="dxa"/>
-              <w:right w:w="90" w:type="dxa"/>
-            </w:tcMar>
-          </w:tcPr>
-          <w:p>
-            <w:pPr>
-              <w:spacing w:after="0" w:line="250" w:lineRule="auto"/>
-              <w:jc w:val="left"/>
-            </w:pPr>
-            <w:r>
-              <w:rPr>
-                <w:sz w:val="19"/>
-              </w:rPr>
-              <w:t>Corrija los límites o deje vacío el máximo.</w:t>
+            <w:tcBorders>
+              <w:bottom w:val="single" w:sz="4" w:space="0" w:color="A6A6A6"/>
+            </w:tcBorders>
+            <w:shd w:val="clear" w:color="auto" w:fill="auto"/>
+            <w:tcMar>
+              <w:top w:w="50" w:type="dxa"/>
+              <w:left w:w="90" w:type="dxa"/>
+              <w:bottom w:w="50" w:type="dxa"/>
+              <w:right w:w="90" w:type="dxa"/>
+            </w:tcMar>
+          </w:tcPr>
+          <w:p>
+            <w:pPr>
+              <w:spacing w:after="0" w:line="250" w:lineRule="auto"/>
+              <w:jc w:val="left"/>
+            </w:pPr>
+            <w:r>
+              <w:rPr>
+                <w:sz w:val="19"/>
+              </w:rPr>
+              <w:t>Cree o active otro administrador antes.</w:t>
             </w:r>
           </w:p>
         </w:tc>
@@ -8657,6 +8896,9 @@
         <w:tc>
           <w:tcPr>
             <w:tcW w:w="4791" w:type="dxa"/>
+            <w:tcBorders>
+              <w:bottom w:val="single" w:sz="4" w:space="0" w:color="A6A6A6"/>
+            </w:tcBorders>
             <w:shd w:val="clear" w:color="auto" w:fill="F2F2F2"/>
             <w:tcMar>
               <w:top w:w="50" w:type="dxa"/>
@@ -8674,13 +8916,16 @@
               <w:rPr>
                 <w:sz w:val="19"/>
               </w:rPr>
-              <w:t>La guía … de … ya fue registrada.</w:t>
+              <w:t>Ya existe un producto con ese código.</w:t>
             </w:r>
           </w:p>
         </w:tc>
         <w:tc>
           <w:tcPr>
             <w:tcW w:w="4949" w:type="dxa"/>
+            <w:tcBorders>
+              <w:bottom w:val="single" w:sz="4" w:space="0" w:color="A6A6A6"/>
+            </w:tcBorders>
             <w:shd w:val="clear" w:color="auto" w:fill="F2F2F2"/>
             <w:tcMar>
               <w:top w:w="50" w:type="dxa"/>
@@ -8698,21 +8943,7 @@
               <w:rPr>
                 <w:sz w:val="19"/>
               </w:rPr>
-              <w:t xml:space="preserve">Esa recepción ya se ingresó; revise </w:t>
-            </w:r>
-            <w:r>
-              <w:rPr>
-                <w:b/>
-                <w:bCs/>
-                <w:sz w:val="19"/>
-              </w:rPr>
-              <w:t>Movimientos recientes</w:t>
-            </w:r>
-            <w:r>
-              <w:rPr>
-                <w:sz w:val="19"/>
-              </w:rPr>
-              <w:t>.</w:t>
+              <w:t>Use otro código o edite el producto existente.</w:t>
             </w:r>
           </w:p>
         </w:tc>
@@ -8724,46 +8955,54 @@
         <w:tc>
           <w:tcPr>
             <w:tcW w:w="4791" w:type="dxa"/>
-            <w:tcMar>
-              <w:top w:w="50" w:type="dxa"/>
-              <w:left w:w="90" w:type="dxa"/>
-              <w:bottom w:w="50" w:type="dxa"/>
-              <w:right w:w="90" w:type="dxa"/>
-            </w:tcMar>
-          </w:tcPr>
-          <w:p>
-            <w:pPr>
-              <w:spacing w:after="0" w:line="250" w:lineRule="auto"/>
-              <w:jc w:val="left"/>
-            </w:pPr>
-            <w:r>
-              <w:rPr>
-                <w:sz w:val="19"/>
-              </w:rPr>
-              <w:t>El personal puede aplicar como máximo 10 % de descuento manual. …</w:t>
+            <w:tcBorders>
+              <w:bottom w:val="single" w:sz="4" w:space="0" w:color="A6A6A6"/>
+            </w:tcBorders>
+            <w:shd w:val="clear" w:color="auto" w:fill="auto"/>
+            <w:tcMar>
+              <w:top w:w="50" w:type="dxa"/>
+              <w:left w:w="90" w:type="dxa"/>
+              <w:bottom w:w="50" w:type="dxa"/>
+              <w:right w:w="90" w:type="dxa"/>
+            </w:tcMar>
+          </w:tcPr>
+          <w:p>
+            <w:pPr>
+              <w:spacing w:after="0" w:line="250" w:lineRule="auto"/>
+              <w:jc w:val="left"/>
+            </w:pPr>
+            <w:r>
+              <w:rPr>
+                <w:sz w:val="19"/>
+              </w:rPr>
+              <w:t>El stock máximo debe ser mayor que el mínimo.</w:t>
             </w:r>
           </w:p>
         </w:tc>
         <w:tc>
           <w:tcPr>
             <w:tcW w:w="4949" w:type="dxa"/>
-            <w:tcMar>
-              <w:top w:w="50" w:type="dxa"/>
-              <w:left w:w="90" w:type="dxa"/>
-              <w:bottom w:w="50" w:type="dxa"/>
-              <w:right w:w="90" w:type="dxa"/>
-            </w:tcMar>
-          </w:tcPr>
-          <w:p>
-            <w:pPr>
-              <w:spacing w:after="0" w:line="250" w:lineRule="auto"/>
-              <w:jc w:val="left"/>
-            </w:pPr>
-            <w:r>
-              <w:rPr>
-                <w:sz w:val="19"/>
-              </w:rPr>
-              <w:t>Lo ve el personal. Si corresponde un descuento mayor, cobre usted la venta desde su sesión.</w:t>
+            <w:tcBorders>
+              <w:bottom w:val="single" w:sz="4" w:space="0" w:color="A6A6A6"/>
+            </w:tcBorders>
+            <w:shd w:val="clear" w:color="auto" w:fill="auto"/>
+            <w:tcMar>
+              <w:top w:w="50" w:type="dxa"/>
+              <w:left w:w="90" w:type="dxa"/>
+              <w:bottom w:w="50" w:type="dxa"/>
+              <w:right w:w="90" w:type="dxa"/>
+            </w:tcMar>
+          </w:tcPr>
+          <w:p>
+            <w:pPr>
+              <w:spacing w:after="0" w:line="250" w:lineRule="auto"/>
+              <w:jc w:val="left"/>
+            </w:pPr>
+            <w:r>
+              <w:rPr>
+                <w:sz w:val="19"/>
+              </w:rPr>
+              <w:t>Corrija los límites o deje vacío el máximo.</w:t>
             </w:r>
           </w:p>
         </w:tc>
@@ -8775,6 +9014,9 @@
         <w:tc>
           <w:tcPr>
             <w:tcW w:w="4791" w:type="dxa"/>
+            <w:tcBorders>
+              <w:bottom w:val="single" w:sz="4" w:space="0" w:color="A6A6A6"/>
+            </w:tcBorders>
             <w:shd w:val="clear" w:color="auto" w:fill="F2F2F2"/>
             <w:tcMar>
               <w:top w:w="50" w:type="dxa"/>
@@ -8792,13 +9034,16 @@
               <w:rPr>
                 <w:sz w:val="19"/>
               </w:rPr>
-              <w:t>El lote ya está vencido. No se puede recibir.</w:t>
+              <w:t>La guía … de … ya fue registrada.</w:t>
             </w:r>
           </w:p>
         </w:tc>
         <w:tc>
           <w:tcPr>
             <w:tcW w:w="4949" w:type="dxa"/>
+            <w:tcBorders>
+              <w:bottom w:val="single" w:sz="4" w:space="0" w:color="A6A6A6"/>
+            </w:tcBorders>
             <w:shd w:val="clear" w:color="auto" w:fill="F2F2F2"/>
             <w:tcMar>
               <w:top w:w="50" w:type="dxa"/>
@@ -8816,7 +9061,21 @@
               <w:rPr>
                 <w:sz w:val="19"/>
               </w:rPr>
-              <w:t>No ingrese ese lote; coordine la devolución con el proveedor.</w:t>
+              <w:t xml:space="preserve">Esa recepción ya se ingresó; revise </w:t>
+            </w:r>
+            <w:r>
+              <w:rPr>
+                <w:b/>
+                <w:bCs/>
+                <w:sz w:val="19"/>
+              </w:rPr>
+              <w:t>Movimientos recientes</w:t>
+            </w:r>
+            <w:r>
+              <w:rPr>
+                <w:sz w:val="19"/>
+              </w:rPr>
+              <w:t>.</w:t>
             </w:r>
           </w:p>
         </w:tc>
@@ -8828,46 +9087,54 @@
         <w:tc>
           <w:tcPr>
             <w:tcW w:w="4791" w:type="dxa"/>
-            <w:tcMar>
-              <w:top w:w="50" w:type="dxa"/>
-              <w:left w:w="90" w:type="dxa"/>
-              <w:bottom w:w="50" w:type="dxa"/>
-              <w:right w:w="90" w:type="dxa"/>
-            </w:tcMar>
-          </w:tcPr>
-          <w:p>
-            <w:pPr>
-              <w:spacing w:after="0" w:line="250" w:lineRule="auto"/>
-              <w:jc w:val="left"/>
-            </w:pPr>
-            <w:r>
-              <w:rPr>
-                <w:sz w:val="19"/>
-              </w:rPr>
-              <w:t>Seleccione una o más mermas pendientes.</w:t>
+            <w:tcBorders>
+              <w:bottom w:val="single" w:sz="4" w:space="0" w:color="A6A6A6"/>
+            </w:tcBorders>
+            <w:shd w:val="clear" w:color="auto" w:fill="auto"/>
+            <w:tcMar>
+              <w:top w:w="50" w:type="dxa"/>
+              <w:left w:w="90" w:type="dxa"/>
+              <w:bottom w:w="50" w:type="dxa"/>
+              <w:right w:w="90" w:type="dxa"/>
+            </w:tcMar>
+          </w:tcPr>
+          <w:p>
+            <w:pPr>
+              <w:spacing w:after="0" w:line="250" w:lineRule="auto"/>
+              <w:jc w:val="left"/>
+            </w:pPr>
+            <w:r>
+              <w:rPr>
+                <w:sz w:val="19"/>
+              </w:rPr>
+              <w:t>El personal puede aplicar como máximo 10 % de descuento manual. …</w:t>
             </w:r>
           </w:p>
         </w:tc>
         <w:tc>
           <w:tcPr>
             <w:tcW w:w="4949" w:type="dxa"/>
-            <w:tcMar>
-              <w:top w:w="50" w:type="dxa"/>
-              <w:left w:w="90" w:type="dxa"/>
-              <w:bottom w:w="50" w:type="dxa"/>
-              <w:right w:w="90" w:type="dxa"/>
-            </w:tcMar>
-          </w:tcPr>
-          <w:p>
-            <w:pPr>
-              <w:spacing w:after="0" w:line="250" w:lineRule="auto"/>
-              <w:jc w:val="left"/>
-            </w:pPr>
-            <w:r>
-              <w:rPr>
-                <w:sz w:val="19"/>
-              </w:rPr>
-              <w:t>Marque filas en estado Pendiente antes de aprobar o rechazar.</w:t>
+            <w:tcBorders>
+              <w:bottom w:val="single" w:sz="4" w:space="0" w:color="A6A6A6"/>
+            </w:tcBorders>
+            <w:shd w:val="clear" w:color="auto" w:fill="auto"/>
+            <w:tcMar>
+              <w:top w:w="50" w:type="dxa"/>
+              <w:left w:w="90" w:type="dxa"/>
+              <w:bottom w:w="50" w:type="dxa"/>
+              <w:right w:w="90" w:type="dxa"/>
+            </w:tcMar>
+          </w:tcPr>
+          <w:p>
+            <w:pPr>
+              <w:spacing w:after="0" w:line="250" w:lineRule="auto"/>
+              <w:jc w:val="left"/>
+            </w:pPr>
+            <w:r>
+              <w:rPr>
+                <w:sz w:val="19"/>
+              </w:rPr>
+              <w:t>Lo ve el personal. Si corresponde un descuento mayor, cobre usted la venta desde su sesión.</w:t>
             </w:r>
           </w:p>
         </w:tc>
@@ -8879,6 +9146,9 @@
         <w:tc>
           <w:tcPr>
             <w:tcW w:w="4791" w:type="dxa"/>
+            <w:tcBorders>
+              <w:bottom w:val="single" w:sz="4" w:space="0" w:color="A6A6A6"/>
+            </w:tcBorders>
             <w:shd w:val="clear" w:color="auto" w:fill="F2F2F2"/>
             <w:tcMar>
               <w:top w:w="50" w:type="dxa"/>
@@ -8896,13 +9166,16 @@
               <w:rPr>
                 <w:sz w:val="19"/>
               </w:rPr>
-              <w:t>No hay productos por reponer en la selección (o ya están en pedido).</w:t>
+              <w:t>El lote ya está vencido. No se puede recibir.</w:t>
             </w:r>
           </w:p>
         </w:tc>
         <w:tc>
           <w:tcPr>
             <w:tcW w:w="4949" w:type="dxa"/>
+            <w:tcBorders>
+              <w:bottom w:val="single" w:sz="4" w:space="0" w:color="A6A6A6"/>
+            </w:tcBorders>
             <w:shd w:val="clear" w:color="auto" w:fill="F2F2F2"/>
             <w:tcMar>
               <w:top w:w="50" w:type="dxa"/>
@@ -8920,7 +9193,7 @@
               <w:rPr>
                 <w:sz w:val="19"/>
               </w:rPr>
-              <w:t>Esos productos ya tienen una orden pendiente o aprobada.</w:t>
+              <w:t>No ingrese ese lote; coordine la devolución con el proveedor.</w:t>
             </w:r>
           </w:p>
         </w:tc>
@@ -8932,60 +9205,54 @@
         <w:tc>
           <w:tcPr>
             <w:tcW w:w="4791" w:type="dxa"/>
-            <w:tcMar>
-              <w:top w:w="50" w:type="dxa"/>
-              <w:left w:w="90" w:type="dxa"/>
-              <w:bottom w:w="50" w:type="dxa"/>
-              <w:right w:w="90" w:type="dxa"/>
-            </w:tcMar>
-          </w:tcPr>
-          <w:p>
-            <w:pPr>
-              <w:spacing w:after="0" w:line="250" w:lineRule="auto"/>
-              <w:jc w:val="left"/>
-            </w:pPr>
-            <w:r>
-              <w:rPr>
-                <w:sz w:val="19"/>
-              </w:rPr>
-              <w:t>El RUC del negocio debe tener 11 dígitos.</w:t>
+            <w:tcBorders>
+              <w:bottom w:val="single" w:sz="4" w:space="0" w:color="A6A6A6"/>
+            </w:tcBorders>
+            <w:shd w:val="clear" w:color="auto" w:fill="auto"/>
+            <w:tcMar>
+              <w:top w:w="50" w:type="dxa"/>
+              <w:left w:w="90" w:type="dxa"/>
+              <w:bottom w:w="50" w:type="dxa"/>
+              <w:right w:w="90" w:type="dxa"/>
+            </w:tcMar>
+          </w:tcPr>
+          <w:p>
+            <w:pPr>
+              <w:spacing w:after="0" w:line="250" w:lineRule="auto"/>
+              <w:jc w:val="left"/>
+            </w:pPr>
+            <w:r>
+              <w:rPr>
+                <w:sz w:val="19"/>
+              </w:rPr>
+              <w:t>Seleccione una o más mermas pendientes.</w:t>
             </w:r>
           </w:p>
         </w:tc>
         <w:tc>
           <w:tcPr>
             <w:tcW w:w="4949" w:type="dxa"/>
-            <w:tcMar>
-              <w:top w:w="50" w:type="dxa"/>
-              <w:left w:w="90" w:type="dxa"/>
-              <w:bottom w:w="50" w:type="dxa"/>
-              <w:right w:w="90" w:type="dxa"/>
-            </w:tcMar>
-          </w:tcPr>
-          <w:p>
-            <w:pPr>
-              <w:spacing w:after="0" w:line="250" w:lineRule="auto"/>
-              <w:jc w:val="left"/>
-            </w:pPr>
-            <w:r>
-              <w:rPr>
-                <w:sz w:val="19"/>
-              </w:rPr>
-              <w:t xml:space="preserve">Corrija el RUC en </w:t>
-            </w:r>
-            <w:r>
-              <w:rPr>
-                <w:b/>
-                <w:bCs/>
-                <w:sz w:val="19"/>
-              </w:rPr>
-              <w:t>Negocio</w:t>
-            </w:r>
-            <w:r>
-              <w:rPr>
-                <w:sz w:val="19"/>
-              </w:rPr>
-              <w:t>.</w:t>
+            <w:tcBorders>
+              <w:bottom w:val="single" w:sz="4" w:space="0" w:color="A6A6A6"/>
+            </w:tcBorders>
+            <w:shd w:val="clear" w:color="auto" w:fill="auto"/>
+            <w:tcMar>
+              <w:top w:w="50" w:type="dxa"/>
+              <w:left w:w="90" w:type="dxa"/>
+              <w:bottom w:w="50" w:type="dxa"/>
+              <w:right w:w="90" w:type="dxa"/>
+            </w:tcMar>
+          </w:tcPr>
+          <w:p>
+            <w:pPr>
+              <w:spacing w:after="0" w:line="250" w:lineRule="auto"/>
+              <w:jc w:val="left"/>
+            </w:pPr>
+            <w:r>
+              <w:rPr>
+                <w:sz w:val="19"/>
+              </w:rPr>
+              <w:t>Marque filas en estado Pendiente antes de aprobar o rechazar.</w:t>
             </w:r>
           </w:p>
         </w:tc>
@@ -8997,6 +9264,138 @@
         <w:tc>
           <w:tcPr>
             <w:tcW w:w="4791" w:type="dxa"/>
+            <w:tcBorders>
+              <w:bottom w:val="single" w:sz="4" w:space="0" w:color="A6A6A6"/>
+            </w:tcBorders>
+            <w:shd w:val="clear" w:color="auto" w:fill="F2F2F2"/>
+            <w:tcMar>
+              <w:top w:w="50" w:type="dxa"/>
+              <w:left w:w="90" w:type="dxa"/>
+              <w:bottom w:w="50" w:type="dxa"/>
+              <w:right w:w="90" w:type="dxa"/>
+            </w:tcMar>
+          </w:tcPr>
+          <w:p>
+            <w:pPr>
+              <w:spacing w:after="0" w:line="250" w:lineRule="auto"/>
+              <w:jc w:val="left"/>
+            </w:pPr>
+            <w:r>
+              <w:rPr>
+                <w:sz w:val="19"/>
+              </w:rPr>
+              <w:t>No hay productos por reponer en la selección (o ya están en pedido).</w:t>
+            </w:r>
+          </w:p>
+        </w:tc>
+        <w:tc>
+          <w:tcPr>
+            <w:tcW w:w="4949" w:type="dxa"/>
+            <w:tcBorders>
+              <w:bottom w:val="single" w:sz="4" w:space="0" w:color="A6A6A6"/>
+            </w:tcBorders>
+            <w:shd w:val="clear" w:color="auto" w:fill="F2F2F2"/>
+            <w:tcMar>
+              <w:top w:w="50" w:type="dxa"/>
+              <w:left w:w="90" w:type="dxa"/>
+              <w:bottom w:w="50" w:type="dxa"/>
+              <w:right w:w="90" w:type="dxa"/>
+            </w:tcMar>
+          </w:tcPr>
+          <w:p>
+            <w:pPr>
+              <w:spacing w:after="0" w:line="250" w:lineRule="auto"/>
+              <w:jc w:val="left"/>
+            </w:pPr>
+            <w:r>
+              <w:rPr>
+                <w:sz w:val="19"/>
+              </w:rPr>
+              <w:t>Esos productos ya tienen una orden pendiente o aprobada.</w:t>
+            </w:r>
+          </w:p>
+        </w:tc>
+      </w:tr>
+      <w:tr>
+        <w:trPr>
+          <w:cantSplit/>
+        </w:trPr>
+        <w:tc>
+          <w:tcPr>
+            <w:tcW w:w="4791" w:type="dxa"/>
+            <w:tcBorders>
+              <w:bottom w:val="single" w:sz="4" w:space="0" w:color="A6A6A6"/>
+            </w:tcBorders>
+            <w:shd w:val="clear" w:color="auto" w:fill="auto"/>
+            <w:tcMar>
+              <w:top w:w="50" w:type="dxa"/>
+              <w:left w:w="90" w:type="dxa"/>
+              <w:bottom w:w="50" w:type="dxa"/>
+              <w:right w:w="90" w:type="dxa"/>
+            </w:tcMar>
+          </w:tcPr>
+          <w:p>
+            <w:pPr>
+              <w:spacing w:after="0" w:line="250" w:lineRule="auto"/>
+              <w:jc w:val="left"/>
+            </w:pPr>
+            <w:r>
+              <w:rPr>
+                <w:sz w:val="19"/>
+              </w:rPr>
+              <w:t>El RUC del negocio debe tener 11 dígitos.</w:t>
+            </w:r>
+          </w:p>
+        </w:tc>
+        <w:tc>
+          <w:tcPr>
+            <w:tcW w:w="4949" w:type="dxa"/>
+            <w:tcBorders>
+              <w:bottom w:val="single" w:sz="4" w:space="0" w:color="A6A6A6"/>
+            </w:tcBorders>
+            <w:shd w:val="clear" w:color="auto" w:fill="auto"/>
+            <w:tcMar>
+              <w:top w:w="50" w:type="dxa"/>
+              <w:left w:w="90" w:type="dxa"/>
+              <w:bottom w:w="50" w:type="dxa"/>
+              <w:right w:w="90" w:type="dxa"/>
+            </w:tcMar>
+          </w:tcPr>
+          <w:p>
+            <w:pPr>
+              <w:spacing w:after="0" w:line="250" w:lineRule="auto"/>
+              <w:jc w:val="left"/>
+            </w:pPr>
+            <w:r>
+              <w:rPr>
+                <w:sz w:val="19"/>
+              </w:rPr>
+              <w:t xml:space="preserve">Corrija el RUC en </w:t>
+            </w:r>
+            <w:r>
+              <w:rPr>
+                <w:b/>
+                <w:bCs/>
+                <w:sz w:val="19"/>
+              </w:rPr>
+              <w:t>Negocio</w:t>
+            </w:r>
+            <w:r>
+              <w:rPr>
+                <w:sz w:val="19"/>
+              </w:rPr>
+              <w:t>.</w:t>
+            </w:r>
+          </w:p>
+        </w:tc>
+      </w:tr>
+      <w:tr>
+        <w:trPr>
+          <w:cantSplit/>
+        </w:trPr>
+        <w:tc>
+          <w:tcPr>
+            <w:tcW w:w="4791" w:type="dxa"/>
             <w:shd w:val="clear" w:color="auto" w:fill="F2F2F2"/>
             <w:tcMar>
               <w:top w:w="50" w:type="dxa"/>
@@ -9119,6 +9518,47 @@
           <w:b/>
           <w:bCs/>
         </w:rPr>
+        <w:t>¿Cómo sé quién anuló una venta y por qué?</w:t>
+      </w:r>
+      <w:r>
+        <w:rPr>
+          <w:bCs/>
+        </w:rPr>
+        <w:t xml:space="preserve"> En </w:t>
+      </w:r>
+      <w:r>
+        <w:rPr>
+          <w:b/>
+          <w:bCs/>
+        </w:rPr>
+        <w:t>Caja</w:t>
+      </w:r>
+      <w:r>
+        <w:rPr>
+          <w:bCs/>
+        </w:rPr>
+        <w:t xml:space="preserve"> → </w:t>
+      </w:r>
+      <w:r>
+        <w:rPr>
+          <w:b/>
+          <w:bCs/>
+        </w:rPr>
+        <w:t>Anulaciones</w:t>
+      </w:r>
+      <w:r>
+        <w:rPr>
+          <w:bCs/>
+        </w:rPr>
+        <w:t xml:space="preserve"> está cada anulación con su usuario, rol, motivo y detalle. El comprobante de la venta también muestra quién la anuló y el motivo.</w:t>
+      </w:r>
+    </w:p>
+    <w:p>
+      <w:r>
+        <w:rPr>
+          <w:b/>
+          <w:bCs/>
+        </w:rPr>
         <w:t>¿Por qué el valor perdido no incluye todas las mermas?</w:t>
       </w:r>
       <w:r>
@@ -9274,7 +9714,7 @@
           <w:b/>
           <w:bCs/>
         </w:rPr>
-        <w:t>16 capturas</w:t>
+        <w:t>17 capturas</w:t>
       </w:r>
       <w:r>
         <w:t>. Tome cada una con datos de demostración y reemplace el marcador correspondiente.</w:t>
@@ -9312,6 +9752,9 @@
         <w:tc>
           <w:tcPr>
             <w:tcW w:w="830" w:type="dxa"/>
+            <w:tcBorders>
+              <w:bottom w:val="single" w:sz="4" w:space="0" w:color="A6A6A6"/>
+            </w:tcBorders>
             <w:shd w:val="clear" w:color="auto" w:fill="1F3864"/>
             <w:tcMar>
               <w:top w:w="50" w:type="dxa"/>
@@ -9338,6 +9781,9 @@
         <w:tc>
           <w:tcPr>
             <w:tcW w:w="1761" w:type="dxa"/>
+            <w:tcBorders>
+              <w:bottom w:val="single" w:sz="4" w:space="0" w:color="A6A6A6"/>
+            </w:tcBorders>
             <w:shd w:val="clear" w:color="auto" w:fill="1F3864"/>
             <w:tcMar>
               <w:top w:w="50" w:type="dxa"/>
@@ -9364,6 +9810,9 @@
         <w:tc>
           <w:tcPr>
             <w:tcW w:w="4318" w:type="dxa"/>
+            <w:tcBorders>
+              <w:bottom w:val="single" w:sz="4" w:space="0" w:color="A6A6A6"/>
+            </w:tcBorders>
             <w:shd w:val="clear" w:color="auto" w:fill="1F3864"/>
             <w:tcMar>
               <w:top w:w="50" w:type="dxa"/>
@@ -9390,6 +9839,9 @@
         <w:tc>
           <w:tcPr>
             <w:tcW w:w="2831" w:type="dxa"/>
+            <w:tcBorders>
+              <w:bottom w:val="single" w:sz="4" w:space="0" w:color="A6A6A6"/>
+            </w:tcBorders>
             <w:shd w:val="clear" w:color="auto" w:fill="1F3864"/>
             <w:tcMar>
               <w:top w:w="50" w:type="dxa"/>
@@ -9421,6 +9873,10 @@
         <w:tc>
           <w:tcPr>
             <w:tcW w:w="830" w:type="dxa"/>
+            <w:tcBorders>
+              <w:bottom w:val="single" w:sz="4" w:space="0" w:color="A6A6A6"/>
+            </w:tcBorders>
+            <w:shd w:val="clear" w:color="auto" w:fill="auto"/>
             <w:tcMar>
               <w:top w:w="50" w:type="dxa"/>
               <w:left w:w="90" w:type="dxa"/>
@@ -9444,6 +9900,10 @@
         <w:tc>
           <w:tcPr>
             <w:tcW w:w="1761" w:type="dxa"/>
+            <w:tcBorders>
+              <w:bottom w:val="single" w:sz="4" w:space="0" w:color="A6A6A6"/>
+            </w:tcBorders>
+            <w:shd w:val="clear" w:color="auto" w:fill="auto"/>
             <w:tcMar>
               <w:top w:w="50" w:type="dxa"/>
               <w:left w:w="90" w:type="dxa"/>
@@ -9467,6 +9927,10 @@
         <w:tc>
           <w:tcPr>
             <w:tcW w:w="4318" w:type="dxa"/>
+            <w:tcBorders>
+              <w:bottom w:val="single" w:sz="4" w:space="0" w:color="A6A6A6"/>
+            </w:tcBorders>
+            <w:shd w:val="clear" w:color="auto" w:fill="auto"/>
             <w:tcMar>
               <w:top w:w="50" w:type="dxa"/>
               <w:left w:w="90" w:type="dxa"/>
@@ -9490,6 +9954,10 @@
         <w:tc>
           <w:tcPr>
             <w:tcW w:w="2831" w:type="dxa"/>
+            <w:tcBorders>
+              <w:bottom w:val="single" w:sz="4" w:space="0" w:color="A6A6A6"/>
+            </w:tcBorders>
+            <w:shd w:val="clear" w:color="auto" w:fill="auto"/>
             <w:tcMar>
               <w:top w:w="50" w:type="dxa"/>
               <w:left w:w="90" w:type="dxa"/>
@@ -9518,6 +9986,9 @@
         <w:tc>
           <w:tcPr>
             <w:tcW w:w="830" w:type="dxa"/>
+            <w:tcBorders>
+              <w:bottom w:val="single" w:sz="4" w:space="0" w:color="A6A6A6"/>
+            </w:tcBorders>
             <w:shd w:val="clear" w:color="auto" w:fill="F2F2F2"/>
             <w:tcMar>
               <w:top w:w="50" w:type="dxa"/>
@@ -9542,6 +10013,9 @@
         <w:tc>
           <w:tcPr>
             <w:tcW w:w="1761" w:type="dxa"/>
+            <w:tcBorders>
+              <w:bottom w:val="single" w:sz="4" w:space="0" w:color="A6A6A6"/>
+            </w:tcBorders>
             <w:shd w:val="clear" w:color="auto" w:fill="F2F2F2"/>
             <w:tcMar>
               <w:top w:w="50" w:type="dxa"/>
@@ -9566,6 +10040,9 @@
         <w:tc>
           <w:tcPr>
             <w:tcW w:w="4318" w:type="dxa"/>
+            <w:tcBorders>
+              <w:bottom w:val="single" w:sz="4" w:space="0" w:color="A6A6A6"/>
+            </w:tcBorders>
             <w:shd w:val="clear" w:color="auto" w:fill="F2F2F2"/>
             <w:tcMar>
               <w:top w:w="50" w:type="dxa"/>
@@ -9590,6 +10067,9 @@
         <w:tc>
           <w:tcPr>
             <w:tcW w:w="2831" w:type="dxa"/>
+            <w:tcBorders>
+              <w:bottom w:val="single" w:sz="4" w:space="0" w:color="A6A6A6"/>
+            </w:tcBorders>
             <w:shd w:val="clear" w:color="auto" w:fill="F2F2F2"/>
             <w:tcMar>
               <w:top w:w="50" w:type="dxa"/>
@@ -9619,6 +10099,10 @@
         <w:tc>
           <w:tcPr>
             <w:tcW w:w="830" w:type="dxa"/>
+            <w:tcBorders>
+              <w:bottom w:val="single" w:sz="4" w:space="0" w:color="A6A6A6"/>
+            </w:tcBorders>
+            <w:shd w:val="clear" w:color="auto" w:fill="auto"/>
             <w:tcMar>
               <w:top w:w="50" w:type="dxa"/>
               <w:left w:w="90" w:type="dxa"/>
@@ -9642,6 +10126,10 @@
         <w:tc>
           <w:tcPr>
             <w:tcW w:w="1761" w:type="dxa"/>
+            <w:tcBorders>
+              <w:bottom w:val="single" w:sz="4" w:space="0" w:color="A6A6A6"/>
+            </w:tcBorders>
+            <w:shd w:val="clear" w:color="auto" w:fill="auto"/>
             <w:tcMar>
               <w:top w:w="50" w:type="dxa"/>
               <w:left w:w="90" w:type="dxa"/>
@@ -9665,6 +10153,10 @@
         <w:tc>
           <w:tcPr>
             <w:tcW w:w="4318" w:type="dxa"/>
+            <w:tcBorders>
+              <w:bottom w:val="single" w:sz="4" w:space="0" w:color="A6A6A6"/>
+            </w:tcBorders>
+            <w:shd w:val="clear" w:color="auto" w:fill="auto"/>
             <w:tcMar>
               <w:top w:w="50" w:type="dxa"/>
               <w:left w:w="90" w:type="dxa"/>
@@ -9688,6 +10180,10 @@
         <w:tc>
           <w:tcPr>
             <w:tcW w:w="2831" w:type="dxa"/>
+            <w:tcBorders>
+              <w:bottom w:val="single" w:sz="4" w:space="0" w:color="A6A6A6"/>
+            </w:tcBorders>
+            <w:shd w:val="clear" w:color="auto" w:fill="auto"/>
             <w:tcMar>
               <w:top w:w="50" w:type="dxa"/>
               <w:left w:w="90" w:type="dxa"/>
@@ -9716,6 +10212,9 @@
         <w:tc>
           <w:tcPr>
             <w:tcW w:w="830" w:type="dxa"/>
+            <w:tcBorders>
+              <w:bottom w:val="single" w:sz="4" w:space="0" w:color="A6A6A6"/>
+            </w:tcBorders>
             <w:shd w:val="clear" w:color="auto" w:fill="F2F2F2"/>
             <w:tcMar>
               <w:top w:w="50" w:type="dxa"/>
@@ -9740,6 +10239,9 @@
         <w:tc>
           <w:tcPr>
             <w:tcW w:w="1761" w:type="dxa"/>
+            <w:tcBorders>
+              <w:bottom w:val="single" w:sz="4" w:space="0" w:color="A6A6A6"/>
+            </w:tcBorders>
             <w:shd w:val="clear" w:color="auto" w:fill="F2F2F2"/>
             <w:tcMar>
               <w:top w:w="50" w:type="dxa"/>
@@ -9764,6 +10266,9 @@
         <w:tc>
           <w:tcPr>
             <w:tcW w:w="4318" w:type="dxa"/>
+            <w:tcBorders>
+              <w:bottom w:val="single" w:sz="4" w:space="0" w:color="A6A6A6"/>
+            </w:tcBorders>
             <w:shd w:val="clear" w:color="auto" w:fill="F2F2F2"/>
             <w:tcMar>
               <w:top w:w="50" w:type="dxa"/>
@@ -9794,6 +10299,9 @@
         <w:tc>
           <w:tcPr>
             <w:tcW w:w="2831" w:type="dxa"/>
+            <w:tcBorders>
+              <w:bottom w:val="single" w:sz="4" w:space="0" w:color="A6A6A6"/>
+            </w:tcBorders>
             <w:shd w:val="clear" w:color="auto" w:fill="F2F2F2"/>
             <w:tcMar>
               <w:top w:w="50" w:type="dxa"/>
@@ -9823,6 +10331,10 @@
         <w:tc>
           <w:tcPr>
             <w:tcW w:w="830" w:type="dxa"/>
+            <w:tcBorders>
+              <w:bottom w:val="single" w:sz="4" w:space="0" w:color="A6A6A6"/>
+            </w:tcBorders>
+            <w:shd w:val="clear" w:color="auto" w:fill="auto"/>
             <w:tcMar>
               <w:top w:w="50" w:type="dxa"/>
               <w:left w:w="90" w:type="dxa"/>
@@ -9846,6 +10358,10 @@
         <w:tc>
           <w:tcPr>
             <w:tcW w:w="1761" w:type="dxa"/>
+            <w:tcBorders>
+              <w:bottom w:val="single" w:sz="4" w:space="0" w:color="A6A6A6"/>
+            </w:tcBorders>
+            <w:shd w:val="clear" w:color="auto" w:fill="auto"/>
             <w:tcMar>
               <w:top w:w="50" w:type="dxa"/>
               <w:left w:w="90" w:type="dxa"/>
@@ -9869,6 +10385,10 @@
         <w:tc>
           <w:tcPr>
             <w:tcW w:w="4318" w:type="dxa"/>
+            <w:tcBorders>
+              <w:bottom w:val="single" w:sz="4" w:space="0" w:color="A6A6A6"/>
+            </w:tcBorders>
+            <w:shd w:val="clear" w:color="auto" w:fill="auto"/>
             <w:tcMar>
               <w:top w:w="50" w:type="dxa"/>
               <w:left w:w="90" w:type="dxa"/>
@@ -9892,6 +10412,10 @@
         <w:tc>
           <w:tcPr>
             <w:tcW w:w="2831" w:type="dxa"/>
+            <w:tcBorders>
+              <w:bottom w:val="single" w:sz="4" w:space="0" w:color="A6A6A6"/>
+            </w:tcBorders>
+            <w:shd w:val="clear" w:color="auto" w:fill="auto"/>
             <w:tcMar>
               <w:top w:w="50" w:type="dxa"/>
               <w:left w:w="90" w:type="dxa"/>
@@ -9920,6 +10444,9 @@
         <w:tc>
           <w:tcPr>
             <w:tcW w:w="830" w:type="dxa"/>
+            <w:tcBorders>
+              <w:bottom w:val="single" w:sz="4" w:space="0" w:color="A6A6A6"/>
+            </w:tcBorders>
             <w:shd w:val="clear" w:color="auto" w:fill="F2F2F2"/>
             <w:tcMar>
               <w:top w:w="50" w:type="dxa"/>
@@ -9944,6 +10471,9 @@
         <w:tc>
           <w:tcPr>
             <w:tcW w:w="1761" w:type="dxa"/>
+            <w:tcBorders>
+              <w:bottom w:val="single" w:sz="4" w:space="0" w:color="A6A6A6"/>
+            </w:tcBorders>
             <w:shd w:val="clear" w:color="auto" w:fill="F2F2F2"/>
             <w:tcMar>
               <w:top w:w="50" w:type="dxa"/>
@@ -9968,6 +10498,9 @@
         <w:tc>
           <w:tcPr>
             <w:tcW w:w="4318" w:type="dxa"/>
+            <w:tcBorders>
+              <w:bottom w:val="single" w:sz="4" w:space="0" w:color="A6A6A6"/>
+            </w:tcBorders>
             <w:shd w:val="clear" w:color="auto" w:fill="F2F2F2"/>
             <w:tcMar>
               <w:top w:w="50" w:type="dxa"/>
@@ -9992,6 +10525,9 @@
         <w:tc>
           <w:tcPr>
             <w:tcW w:w="2831" w:type="dxa"/>
+            <w:tcBorders>
+              <w:bottom w:val="single" w:sz="4" w:space="0" w:color="A6A6A6"/>
+            </w:tcBorders>
             <w:shd w:val="clear" w:color="auto" w:fill="F2F2F2"/>
             <w:tcMar>
               <w:top w:w="50" w:type="dxa"/>
@@ -10021,6 +10557,10 @@
         <w:tc>
           <w:tcPr>
             <w:tcW w:w="830" w:type="dxa"/>
+            <w:tcBorders>
+              <w:bottom w:val="single" w:sz="4" w:space="0" w:color="A6A6A6"/>
+            </w:tcBorders>
+            <w:shd w:val="clear" w:color="auto" w:fill="auto"/>
             <w:tcMar>
               <w:top w:w="50" w:type="dxa"/>
               <w:left w:w="90" w:type="dxa"/>
@@ -10044,6 +10584,10 @@
         <w:tc>
           <w:tcPr>
             <w:tcW w:w="1761" w:type="dxa"/>
+            <w:tcBorders>
+              <w:bottom w:val="single" w:sz="4" w:space="0" w:color="A6A6A6"/>
+            </w:tcBorders>
+            <w:shd w:val="clear" w:color="auto" w:fill="auto"/>
             <w:tcMar>
               <w:top w:w="50" w:type="dxa"/>
               <w:left w:w="90" w:type="dxa"/>
@@ -10067,29 +10611,37 @@
         <w:tc>
           <w:tcPr>
             <w:tcW w:w="4318" w:type="dxa"/>
-            <w:tcMar>
-              <w:top w:w="50" w:type="dxa"/>
-              <w:left w:w="90" w:type="dxa"/>
-              <w:bottom w:w="50" w:type="dxa"/>
-              <w:right w:w="90" w:type="dxa"/>
-            </w:tcMar>
-          </w:tcPr>
-          <w:p>
-            <w:pPr>
-              <w:spacing w:after="0" w:line="250" w:lineRule="auto"/>
-              <w:jc w:val="left"/>
-            </w:pPr>
-            <w:r>
-              <w:rPr>
-                <w:sz w:val="19"/>
-              </w:rPr>
-              <w:t>Ventana "Anular venta" con el motivo de la anulación</w:t>
+            <w:tcBorders>
+              <w:bottom w:val="single" w:sz="4" w:space="0" w:color="A6A6A6"/>
+            </w:tcBorders>
+            <w:shd w:val="clear" w:color="auto" w:fill="auto"/>
+            <w:tcMar>
+              <w:top w:w="50" w:type="dxa"/>
+              <w:left w:w="90" w:type="dxa"/>
+              <w:bottom w:w="50" w:type="dxa"/>
+              <w:right w:w="90" w:type="dxa"/>
+            </w:tcMar>
+          </w:tcPr>
+          <w:p>
+            <w:pPr>
+              <w:spacing w:after="0" w:line="250" w:lineRule="auto"/>
+              <w:jc w:val="left"/>
+            </w:pPr>
+            <w:r>
+              <w:rPr>
+                <w:sz w:val="19"/>
+              </w:rPr>
+              <w:t>Ventana "Anular venta" con la lista de motivos y el detalle</w:t>
             </w:r>
           </w:p>
         </w:tc>
         <w:tc>
           <w:tcPr>
             <w:tcW w:w="2831" w:type="dxa"/>
+            <w:tcBorders>
+              <w:bottom w:val="single" w:sz="4" w:space="0" w:color="A6A6A6"/>
+            </w:tcBorders>
+            <w:shd w:val="clear" w:color="auto" w:fill="auto"/>
             <w:tcMar>
               <w:top w:w="50" w:type="dxa"/>
               <w:left w:w="90" w:type="dxa"/>
@@ -10118,6 +10670,9 @@
         <w:tc>
           <w:tcPr>
             <w:tcW w:w="830" w:type="dxa"/>
+            <w:tcBorders>
+              <w:bottom w:val="single" w:sz="4" w:space="0" w:color="A6A6A6"/>
+            </w:tcBorders>
             <w:shd w:val="clear" w:color="auto" w:fill="F2F2F2"/>
             <w:tcMar>
               <w:top w:w="50" w:type="dxa"/>
@@ -10130,18 +10685,24 @@
             <w:pPr>
               <w:spacing w:after="0" w:line="250" w:lineRule="auto"/>
               <w:jc w:val="left"/>
-            </w:pPr>
-            <w:r>
-              <w:rPr>
-                <w:sz w:val="19"/>
-              </w:rPr>
-              <w:t>4.7.1</w:t>
+              <w:rPr>
+                <w:sz w:val="19"/>
+              </w:rPr>
+            </w:pPr>
+            <w:r>
+              <w:rPr>
+                <w:sz w:val="19"/>
+              </w:rPr>
+              <w:t>4.6.2</w:t>
             </w:r>
           </w:p>
         </w:tc>
         <w:tc>
           <w:tcPr>
             <w:tcW w:w="1761" w:type="dxa"/>
+            <w:tcBorders>
+              <w:bottom w:val="single" w:sz="4" w:space="0" w:color="A6A6A6"/>
+            </w:tcBorders>
             <w:shd w:val="clear" w:color="auto" w:fill="F2F2F2"/>
             <w:tcMar>
               <w:top w:w="50" w:type="dxa"/>
@@ -10154,18 +10715,24 @@
             <w:pPr>
               <w:spacing w:after="0" w:line="250" w:lineRule="auto"/>
               <w:jc w:val="left"/>
-            </w:pPr>
-            <w:r>
-              <w:rPr>
-                <w:sz w:val="19"/>
-              </w:rPr>
-              <w:t>Usuarios</w:t>
+              <w:rPr>
+                <w:sz w:val="19"/>
+              </w:rPr>
+            </w:pPr>
+            <w:r>
+              <w:rPr>
+                <w:sz w:val="19"/>
+              </w:rPr>
+              <w:t>Caja, pestaña Anulaciones</w:t>
             </w:r>
           </w:p>
         </w:tc>
         <w:tc>
           <w:tcPr>
             <w:tcW w:w="4318" w:type="dxa"/>
+            <w:tcBorders>
+              <w:bottom w:val="single" w:sz="4" w:space="0" w:color="A6A6A6"/>
+            </w:tcBorders>
             <w:shd w:val="clear" w:color="auto" w:fill="F2F2F2"/>
             <w:tcMar>
               <w:top w:w="50" w:type="dxa"/>
@@ -10178,18 +10745,24 @@
             <w:pPr>
               <w:spacing w:after="0" w:line="250" w:lineRule="auto"/>
               <w:jc w:val="left"/>
-            </w:pPr>
-            <w:r>
-              <w:rPr>
-                <w:sz w:val="19"/>
-              </w:rPr>
-              <w:t>Ventana "Registrar Nuevo Usuario" con el rol elegido</w:t>
+              <w:rPr>
+                <w:sz w:val="19"/>
+              </w:rPr>
+            </w:pPr>
+            <w:r>
+              <w:rPr>
+                <w:sz w:val="19"/>
+              </w:rPr>
+              <w:t>Registro de todos los usuarios con el filtro Período</w:t>
             </w:r>
           </w:p>
         </w:tc>
         <w:tc>
           <w:tcPr>
             <w:tcW w:w="2831" w:type="dxa"/>
+            <w:tcBorders>
+              <w:bottom w:val="single" w:sz="4" w:space="0" w:color="A6A6A6"/>
+            </w:tcBorders>
             <w:shd w:val="clear" w:color="auto" w:fill="F2F2F2"/>
             <w:tcMar>
               <w:top w:w="50" w:type="dxa"/>
@@ -10202,12 +10775,15 @@
             <w:pPr>
               <w:spacing w:after="0" w:line="250" w:lineRule="auto"/>
               <w:jc w:val="left"/>
-            </w:pPr>
-            <w:r>
-              <w:rPr>
-                <w:sz w:val="19"/>
-              </w:rPr>
-              <w:t>4.7 Gestionar usuarios y roles</w:t>
+              <w:rPr>
+                <w:sz w:val="19"/>
+              </w:rPr>
+            </w:pPr>
+            <w:r>
+              <w:rPr>
+                <w:sz w:val="19"/>
+              </w:rPr>
+              <w:t>4.6 Anular una venta</w:t>
             </w:r>
           </w:p>
         </w:tc>
@@ -10219,92 +10795,108 @@
         <w:tc>
           <w:tcPr>
             <w:tcW w:w="830" w:type="dxa"/>
-            <w:tcMar>
-              <w:top w:w="50" w:type="dxa"/>
-              <w:left w:w="90" w:type="dxa"/>
-              <w:bottom w:w="50" w:type="dxa"/>
-              <w:right w:w="90" w:type="dxa"/>
-            </w:tcMar>
-          </w:tcPr>
-          <w:p>
-            <w:pPr>
-              <w:spacing w:after="0" w:line="250" w:lineRule="auto"/>
-              <w:jc w:val="left"/>
-            </w:pPr>
-            <w:r>
-              <w:rPr>
-                <w:sz w:val="19"/>
-              </w:rPr>
-              <w:t>4.8.1</w:t>
+            <w:tcBorders>
+              <w:bottom w:val="single" w:sz="4" w:space="0" w:color="A6A6A6"/>
+            </w:tcBorders>
+            <w:shd w:val="clear" w:color="auto" w:fill="auto"/>
+            <w:tcMar>
+              <w:top w:w="50" w:type="dxa"/>
+              <w:left w:w="90" w:type="dxa"/>
+              <w:bottom w:w="50" w:type="dxa"/>
+              <w:right w:w="90" w:type="dxa"/>
+            </w:tcMar>
+          </w:tcPr>
+          <w:p>
+            <w:pPr>
+              <w:spacing w:after="0" w:line="250" w:lineRule="auto"/>
+              <w:jc w:val="left"/>
+            </w:pPr>
+            <w:r>
+              <w:rPr>
+                <w:sz w:val="19"/>
+              </w:rPr>
+              <w:t>4.7.1</w:t>
             </w:r>
           </w:p>
         </w:tc>
         <w:tc>
           <w:tcPr>
             <w:tcW w:w="1761" w:type="dxa"/>
-            <w:tcMar>
-              <w:top w:w="50" w:type="dxa"/>
-              <w:left w:w="90" w:type="dxa"/>
-              <w:bottom w:w="50" w:type="dxa"/>
-              <w:right w:w="90" w:type="dxa"/>
-            </w:tcMar>
-          </w:tcPr>
-          <w:p>
-            <w:pPr>
-              <w:spacing w:after="0" w:line="250" w:lineRule="auto"/>
-              <w:jc w:val="left"/>
-            </w:pPr>
-            <w:r>
-              <w:rPr>
-                <w:sz w:val="19"/>
-              </w:rPr>
-              <w:t>Productos</w:t>
+            <w:tcBorders>
+              <w:bottom w:val="single" w:sz="4" w:space="0" w:color="A6A6A6"/>
+            </w:tcBorders>
+            <w:shd w:val="clear" w:color="auto" w:fill="auto"/>
+            <w:tcMar>
+              <w:top w:w="50" w:type="dxa"/>
+              <w:left w:w="90" w:type="dxa"/>
+              <w:bottom w:w="50" w:type="dxa"/>
+              <w:right w:w="90" w:type="dxa"/>
+            </w:tcMar>
+          </w:tcPr>
+          <w:p>
+            <w:pPr>
+              <w:spacing w:after="0" w:line="250" w:lineRule="auto"/>
+              <w:jc w:val="left"/>
+            </w:pPr>
+            <w:r>
+              <w:rPr>
+                <w:sz w:val="19"/>
+              </w:rPr>
+              <w:t>Usuarios</w:t>
             </w:r>
           </w:p>
         </w:tc>
         <w:tc>
           <w:tcPr>
             <w:tcW w:w="4318" w:type="dxa"/>
-            <w:tcMar>
-              <w:top w:w="50" w:type="dxa"/>
-              <w:left w:w="90" w:type="dxa"/>
-              <w:bottom w:w="50" w:type="dxa"/>
-              <w:right w:w="90" w:type="dxa"/>
-            </w:tcMar>
-          </w:tcPr>
-          <w:p>
-            <w:pPr>
-              <w:spacing w:after="0" w:line="250" w:lineRule="auto"/>
-              <w:jc w:val="left"/>
-            </w:pPr>
-            <w:r>
-              <w:rPr>
-                <w:sz w:val="19"/>
-              </w:rPr>
-              <w:t>Ventana "Editar producto" con precio y stock mínimo y máximo</w:t>
+            <w:tcBorders>
+              <w:bottom w:val="single" w:sz="4" w:space="0" w:color="A6A6A6"/>
+            </w:tcBorders>
+            <w:shd w:val="clear" w:color="auto" w:fill="auto"/>
+            <w:tcMar>
+              <w:top w:w="50" w:type="dxa"/>
+              <w:left w:w="90" w:type="dxa"/>
+              <w:bottom w:w="50" w:type="dxa"/>
+              <w:right w:w="90" w:type="dxa"/>
+            </w:tcMar>
+          </w:tcPr>
+          <w:p>
+            <w:pPr>
+              <w:spacing w:after="0" w:line="250" w:lineRule="auto"/>
+              <w:jc w:val="left"/>
+            </w:pPr>
+            <w:r>
+              <w:rPr>
+                <w:sz w:val="19"/>
+              </w:rPr>
+              <w:t>Ventana "Registrar Nuevo Usuario" con el rol elegido</w:t>
             </w:r>
           </w:p>
         </w:tc>
         <w:tc>
           <w:tcPr>
             <w:tcW w:w="2831" w:type="dxa"/>
-            <w:tcMar>
-              <w:top w:w="50" w:type="dxa"/>
-              <w:left w:w="90" w:type="dxa"/>
-              <w:bottom w:w="50" w:type="dxa"/>
-              <w:right w:w="90" w:type="dxa"/>
-            </w:tcMar>
-          </w:tcPr>
-          <w:p>
-            <w:pPr>
-              <w:spacing w:after="0" w:line="250" w:lineRule="auto"/>
-              <w:jc w:val="left"/>
-            </w:pPr>
-            <w:r>
-              <w:rPr>
-                <w:sz w:val="19"/>
-              </w:rPr>
-              <w:t>4.8 Gestionar productos</w:t>
+            <w:tcBorders>
+              <w:bottom w:val="single" w:sz="4" w:space="0" w:color="A6A6A6"/>
+            </w:tcBorders>
+            <w:shd w:val="clear" w:color="auto" w:fill="auto"/>
+            <w:tcMar>
+              <w:top w:w="50" w:type="dxa"/>
+              <w:left w:w="90" w:type="dxa"/>
+              <w:bottom w:w="50" w:type="dxa"/>
+              <w:right w:w="90" w:type="dxa"/>
+            </w:tcMar>
+          </w:tcPr>
+          <w:p>
+            <w:pPr>
+              <w:spacing w:after="0" w:line="250" w:lineRule="auto"/>
+              <w:jc w:val="left"/>
+            </w:pPr>
+            <w:r>
+              <w:rPr>
+                <w:sz w:val="19"/>
+              </w:rPr>
+              <w:t>4.7 Gestionar usuarios y roles</w:t>
             </w:r>
           </w:p>
         </w:tc>
@@ -10316,6 +10908,9 @@
         <w:tc>
           <w:tcPr>
             <w:tcW w:w="830" w:type="dxa"/>
+            <w:tcBorders>
+              <w:bottom w:val="single" w:sz="4" w:space="0" w:color="A6A6A6"/>
+            </w:tcBorders>
             <w:shd w:val="clear" w:color="auto" w:fill="F2F2F2"/>
             <w:tcMar>
               <w:top w:w="50" w:type="dxa"/>
@@ -10333,13 +10928,16 @@
               <w:rPr>
                 <w:sz w:val="19"/>
               </w:rPr>
-              <w:t>4.9.1</w:t>
+              <w:t>4.8.1</w:t>
             </w:r>
           </w:p>
         </w:tc>
         <w:tc>
           <w:tcPr>
             <w:tcW w:w="1761" w:type="dxa"/>
+            <w:tcBorders>
+              <w:bottom w:val="single" w:sz="4" w:space="0" w:color="A6A6A6"/>
+            </w:tcBorders>
             <w:shd w:val="clear" w:color="auto" w:fill="F2F2F2"/>
             <w:tcMar>
               <w:top w:w="50" w:type="dxa"/>
@@ -10357,13 +10955,16 @@
               <w:rPr>
                 <w:sz w:val="19"/>
               </w:rPr>
-              <w:t>Inventario, pestaña Lotes y vencimientos</w:t>
+              <w:t>Productos</w:t>
             </w:r>
           </w:p>
         </w:tc>
         <w:tc>
           <w:tcPr>
             <w:tcW w:w="4318" w:type="dxa"/>
+            <w:tcBorders>
+              <w:bottom w:val="single" w:sz="4" w:space="0" w:color="A6A6A6"/>
+            </w:tcBorders>
             <w:shd w:val="clear" w:color="auto" w:fill="F2F2F2"/>
             <w:tcMar>
               <w:top w:w="50" w:type="dxa"/>
@@ -10381,13 +10982,16 @@
               <w:rPr>
                 <w:sz w:val="19"/>
               </w:rPr>
-              <w:t>Lotes en orden FEFO con su estado y el botón Editar lote</w:t>
+              <w:t>Ventana "Editar producto" con precio y stock mínimo y máximo</w:t>
             </w:r>
           </w:p>
         </w:tc>
         <w:tc>
           <w:tcPr>
             <w:tcW w:w="2831" w:type="dxa"/>
+            <w:tcBorders>
+              <w:bottom w:val="single" w:sz="4" w:space="0" w:color="A6A6A6"/>
+            </w:tcBorders>
             <w:shd w:val="clear" w:color="auto" w:fill="F2F2F2"/>
             <w:tcMar>
               <w:top w:w="50" w:type="dxa"/>
@@ -10405,7 +11009,7 @@
               <w:rPr>
                 <w:sz w:val="19"/>
               </w:rPr>
-              <w:t>4.9 Recibir mercadería y editar lotes</w:t>
+              <w:t>4.8 Gestionar productos</w:t>
             </w:r>
           </w:p>
         </w:tc>
@@ -10417,92 +11021,108 @@
         <w:tc>
           <w:tcPr>
             <w:tcW w:w="830" w:type="dxa"/>
-            <w:tcMar>
-              <w:top w:w="50" w:type="dxa"/>
-              <w:left w:w="90" w:type="dxa"/>
-              <w:bottom w:w="50" w:type="dxa"/>
-              <w:right w:w="90" w:type="dxa"/>
-            </w:tcMar>
-          </w:tcPr>
-          <w:p>
-            <w:pPr>
-              <w:spacing w:after="0" w:line="250" w:lineRule="auto"/>
-              <w:jc w:val="left"/>
-            </w:pPr>
-            <w:r>
-              <w:rPr>
-                <w:sz w:val="19"/>
-              </w:rPr>
-              <w:t>4.10.1</w:t>
+            <w:tcBorders>
+              <w:bottom w:val="single" w:sz="4" w:space="0" w:color="A6A6A6"/>
+            </w:tcBorders>
+            <w:shd w:val="clear" w:color="auto" w:fill="auto"/>
+            <w:tcMar>
+              <w:top w:w="50" w:type="dxa"/>
+              <w:left w:w="90" w:type="dxa"/>
+              <w:bottom w:w="50" w:type="dxa"/>
+              <w:right w:w="90" w:type="dxa"/>
+            </w:tcMar>
+          </w:tcPr>
+          <w:p>
+            <w:pPr>
+              <w:spacing w:after="0" w:line="250" w:lineRule="auto"/>
+              <w:jc w:val="left"/>
+            </w:pPr>
+            <w:r>
+              <w:rPr>
+                <w:sz w:val="19"/>
+              </w:rPr>
+              <w:t>4.9.1</w:t>
             </w:r>
           </w:p>
         </w:tc>
         <w:tc>
           <w:tcPr>
             <w:tcW w:w="1761" w:type="dxa"/>
-            <w:tcMar>
-              <w:top w:w="50" w:type="dxa"/>
-              <w:left w:w="90" w:type="dxa"/>
-              <w:bottom w:w="50" w:type="dxa"/>
-              <w:right w:w="90" w:type="dxa"/>
-            </w:tcMar>
-          </w:tcPr>
-          <w:p>
-            <w:pPr>
-              <w:spacing w:after="0" w:line="250" w:lineRule="auto"/>
-              <w:jc w:val="left"/>
-            </w:pPr>
-            <w:r>
-              <w:rPr>
-                <w:sz w:val="19"/>
-              </w:rPr>
-              <w:t>Mermas</w:t>
+            <w:tcBorders>
+              <w:bottom w:val="single" w:sz="4" w:space="0" w:color="A6A6A6"/>
+            </w:tcBorders>
+            <w:shd w:val="clear" w:color="auto" w:fill="auto"/>
+            <w:tcMar>
+              <w:top w:w="50" w:type="dxa"/>
+              <w:left w:w="90" w:type="dxa"/>
+              <w:bottom w:w="50" w:type="dxa"/>
+              <w:right w:w="90" w:type="dxa"/>
+            </w:tcMar>
+          </w:tcPr>
+          <w:p>
+            <w:pPr>
+              <w:spacing w:after="0" w:line="250" w:lineRule="auto"/>
+              <w:jc w:val="left"/>
+            </w:pPr>
+            <w:r>
+              <w:rPr>
+                <w:sz w:val="19"/>
+              </w:rPr>
+              <w:t>Inventario, pestaña Lotes y vencimientos</w:t>
             </w:r>
           </w:p>
         </w:tc>
         <w:tc>
           <w:tcPr>
             <w:tcW w:w="4318" w:type="dxa"/>
-            <w:tcMar>
-              <w:top w:w="50" w:type="dxa"/>
-              <w:left w:w="90" w:type="dxa"/>
-              <w:bottom w:w="50" w:type="dxa"/>
-              <w:right w:w="90" w:type="dxa"/>
-            </w:tcMar>
-          </w:tcPr>
-          <w:p>
-            <w:pPr>
-              <w:spacing w:after="0" w:line="250" w:lineRule="auto"/>
-              <w:jc w:val="left"/>
-            </w:pPr>
-            <w:r>
-              <w:rPr>
-                <w:sz w:val="19"/>
-              </w:rPr>
-              <w:t>Tarjetas Pendientes de autorizar, Unidades dadas de baja y Valor perdido, con mermas pendientes seleccionadas</w:t>
+            <w:tcBorders>
+              <w:bottom w:val="single" w:sz="4" w:space="0" w:color="A6A6A6"/>
+            </w:tcBorders>
+            <w:shd w:val="clear" w:color="auto" w:fill="auto"/>
+            <w:tcMar>
+              <w:top w:w="50" w:type="dxa"/>
+              <w:left w:w="90" w:type="dxa"/>
+              <w:bottom w:w="50" w:type="dxa"/>
+              <w:right w:w="90" w:type="dxa"/>
+            </w:tcMar>
+          </w:tcPr>
+          <w:p>
+            <w:pPr>
+              <w:spacing w:after="0" w:line="250" w:lineRule="auto"/>
+              <w:jc w:val="left"/>
+            </w:pPr>
+            <w:r>
+              <w:rPr>
+                <w:sz w:val="19"/>
+              </w:rPr>
+              <w:t>Lotes en orden FEFO con su estado y el botón Editar lote</w:t>
             </w:r>
           </w:p>
         </w:tc>
         <w:tc>
           <w:tcPr>
             <w:tcW w:w="2831" w:type="dxa"/>
-            <w:tcMar>
-              <w:top w:w="50" w:type="dxa"/>
-              <w:left w:w="90" w:type="dxa"/>
-              <w:bottom w:w="50" w:type="dxa"/>
-              <w:right w:w="90" w:type="dxa"/>
-            </w:tcMar>
-          </w:tcPr>
-          <w:p>
-            <w:pPr>
-              <w:spacing w:after="0" w:line="250" w:lineRule="auto"/>
-              <w:jc w:val="left"/>
-            </w:pPr>
-            <w:r>
-              <w:rPr>
-                <w:sz w:val="19"/>
-              </w:rPr>
-              <w:t>4.10 Registrar, aprobar o rechazar mermas</w:t>
+            <w:tcBorders>
+              <w:bottom w:val="single" w:sz="4" w:space="0" w:color="A6A6A6"/>
+            </w:tcBorders>
+            <w:shd w:val="clear" w:color="auto" w:fill="auto"/>
+            <w:tcMar>
+              <w:top w:w="50" w:type="dxa"/>
+              <w:left w:w="90" w:type="dxa"/>
+              <w:bottom w:w="50" w:type="dxa"/>
+              <w:right w:w="90" w:type="dxa"/>
+            </w:tcMar>
+          </w:tcPr>
+          <w:p>
+            <w:pPr>
+              <w:spacing w:after="0" w:line="250" w:lineRule="auto"/>
+              <w:jc w:val="left"/>
+            </w:pPr>
+            <w:r>
+              <w:rPr>
+                <w:sz w:val="19"/>
+              </w:rPr>
+              <w:t>4.9 Recibir mercadería y editar lotes</w:t>
             </w:r>
           </w:p>
         </w:tc>
@@ -10514,6 +11134,9 @@
         <w:tc>
           <w:tcPr>
             <w:tcW w:w="830" w:type="dxa"/>
+            <w:tcBorders>
+              <w:bottom w:val="single" w:sz="4" w:space="0" w:color="A6A6A6"/>
+            </w:tcBorders>
             <w:shd w:val="clear" w:color="auto" w:fill="F2F2F2"/>
             <w:tcMar>
               <w:top w:w="50" w:type="dxa"/>
@@ -10531,13 +11154,16 @@
               <w:rPr>
                 <w:sz w:val="19"/>
               </w:rPr>
-              <w:t>4.11.1</w:t>
+              <w:t>4.10.1</w:t>
             </w:r>
           </w:p>
         </w:tc>
         <w:tc>
           <w:tcPr>
             <w:tcW w:w="1761" w:type="dxa"/>
+            <w:tcBorders>
+              <w:bottom w:val="single" w:sz="4" w:space="0" w:color="A6A6A6"/>
+            </w:tcBorders>
             <w:shd w:val="clear" w:color="auto" w:fill="F2F2F2"/>
             <w:tcMar>
               <w:top w:w="50" w:type="dxa"/>
@@ -10555,13 +11181,16 @@
               <w:rPr>
                 <w:sz w:val="19"/>
               </w:rPr>
-              <w:t>Compras, pestaña Órdenes de compra</w:t>
+              <w:t>Mermas</w:t>
             </w:r>
           </w:p>
         </w:tc>
         <w:tc>
           <w:tcPr>
             <w:tcW w:w="4318" w:type="dxa"/>
+            <w:tcBorders>
+              <w:bottom w:val="single" w:sz="4" w:space="0" w:color="A6A6A6"/>
+            </w:tcBorders>
             <w:shd w:val="clear" w:color="auto" w:fill="F2F2F2"/>
             <w:tcMar>
               <w:top w:w="50" w:type="dxa"/>
@@ -10579,13 +11208,16 @@
               <w:rPr>
                 <w:sz w:val="19"/>
               </w:rPr>
-              <w:t>Orden pendiente seleccionada con los botones Aprobar y Rechazar</w:t>
+              <w:t>Tarjetas Pendientes de autorizar, Unidades dadas de baja y Valor perdido, con mermas pendientes seleccionadas</w:t>
             </w:r>
           </w:p>
         </w:tc>
         <w:tc>
           <w:tcPr>
             <w:tcW w:w="2831" w:type="dxa"/>
+            <w:tcBorders>
+              <w:bottom w:val="single" w:sz="4" w:space="0" w:color="A6A6A6"/>
+            </w:tcBorders>
             <w:shd w:val="clear" w:color="auto" w:fill="F2F2F2"/>
             <w:tcMar>
               <w:top w:w="50" w:type="dxa"/>
@@ -10603,7 +11235,7 @@
               <w:rPr>
                 <w:sz w:val="19"/>
               </w:rPr>
-              <w:t>4.11 Alertas de reposición y órdenes de compra</w:t>
+              <w:t>4.10 Registrar, aprobar o rechazar mermas</w:t>
             </w:r>
           </w:p>
         </w:tc>
@@ -10615,92 +11247,108 @@
         <w:tc>
           <w:tcPr>
             <w:tcW w:w="830" w:type="dxa"/>
-            <w:tcMar>
-              <w:top w:w="50" w:type="dxa"/>
-              <w:left w:w="90" w:type="dxa"/>
-              <w:bottom w:w="50" w:type="dxa"/>
-              <w:right w:w="90" w:type="dxa"/>
-            </w:tcMar>
-          </w:tcPr>
-          <w:p>
-            <w:pPr>
-              <w:spacing w:after="0" w:line="250" w:lineRule="auto"/>
-              <w:jc w:val="left"/>
-            </w:pPr>
-            <w:r>
-              <w:rPr>
-                <w:sz w:val="19"/>
-              </w:rPr>
-              <w:t>4.12.1</w:t>
+            <w:tcBorders>
+              <w:bottom w:val="single" w:sz="4" w:space="0" w:color="A6A6A6"/>
+            </w:tcBorders>
+            <w:shd w:val="clear" w:color="auto" w:fill="auto"/>
+            <w:tcMar>
+              <w:top w:w="50" w:type="dxa"/>
+              <w:left w:w="90" w:type="dxa"/>
+              <w:bottom w:w="50" w:type="dxa"/>
+              <w:right w:w="90" w:type="dxa"/>
+            </w:tcMar>
+          </w:tcPr>
+          <w:p>
+            <w:pPr>
+              <w:spacing w:after="0" w:line="250" w:lineRule="auto"/>
+              <w:jc w:val="left"/>
+            </w:pPr>
+            <w:r>
+              <w:rPr>
+                <w:sz w:val="19"/>
+              </w:rPr>
+              <w:t>4.11.1</w:t>
             </w:r>
           </w:p>
         </w:tc>
         <w:tc>
           <w:tcPr>
             <w:tcW w:w="1761" w:type="dxa"/>
-            <w:tcMar>
-              <w:top w:w="50" w:type="dxa"/>
-              <w:left w:w="90" w:type="dxa"/>
-              <w:bottom w:w="50" w:type="dxa"/>
-              <w:right w:w="90" w:type="dxa"/>
-            </w:tcMar>
-          </w:tcPr>
-          <w:p>
-            <w:pPr>
-              <w:spacing w:after="0" w:line="250" w:lineRule="auto"/>
-              <w:jc w:val="left"/>
-            </w:pPr>
-            <w:r>
-              <w:rPr>
-                <w:sz w:val="19"/>
-              </w:rPr>
-              <w:t>Reportes</w:t>
+            <w:tcBorders>
+              <w:bottom w:val="single" w:sz="4" w:space="0" w:color="A6A6A6"/>
+            </w:tcBorders>
+            <w:shd w:val="clear" w:color="auto" w:fill="auto"/>
+            <w:tcMar>
+              <w:top w:w="50" w:type="dxa"/>
+              <w:left w:w="90" w:type="dxa"/>
+              <w:bottom w:w="50" w:type="dxa"/>
+              <w:right w:w="90" w:type="dxa"/>
+            </w:tcMar>
+          </w:tcPr>
+          <w:p>
+            <w:pPr>
+              <w:spacing w:after="0" w:line="250" w:lineRule="auto"/>
+              <w:jc w:val="left"/>
+            </w:pPr>
+            <w:r>
+              <w:rPr>
+                <w:sz w:val="19"/>
+              </w:rPr>
+              <w:t>Compras, pestaña Órdenes de compra</w:t>
             </w:r>
           </w:p>
         </w:tc>
         <w:tc>
           <w:tcPr>
             <w:tcW w:w="4318" w:type="dxa"/>
-            <w:tcMar>
-              <w:top w:w="50" w:type="dxa"/>
-              <w:left w:w="90" w:type="dxa"/>
-              <w:bottom w:w="50" w:type="dxa"/>
-              <w:right w:w="90" w:type="dxa"/>
-            </w:tcMar>
-          </w:tcPr>
-          <w:p>
-            <w:pPr>
-              <w:spacing w:after="0" w:line="250" w:lineRule="auto"/>
-              <w:jc w:val="left"/>
-            </w:pPr>
-            <w:r>
-              <w:rPr>
-                <w:sz w:val="19"/>
-              </w:rPr>
-              <w:t>Indicadores comparados con el período anterior y el gráfico de ventas del período</w:t>
+            <w:tcBorders>
+              <w:bottom w:val="single" w:sz="4" w:space="0" w:color="A6A6A6"/>
+            </w:tcBorders>
+            <w:shd w:val="clear" w:color="auto" w:fill="auto"/>
+            <w:tcMar>
+              <w:top w:w="50" w:type="dxa"/>
+              <w:left w:w="90" w:type="dxa"/>
+              <w:bottom w:w="50" w:type="dxa"/>
+              <w:right w:w="90" w:type="dxa"/>
+            </w:tcMar>
+          </w:tcPr>
+          <w:p>
+            <w:pPr>
+              <w:spacing w:after="0" w:line="250" w:lineRule="auto"/>
+              <w:jc w:val="left"/>
+            </w:pPr>
+            <w:r>
+              <w:rPr>
+                <w:sz w:val="19"/>
+              </w:rPr>
+              <w:t>Orden pendiente seleccionada con los botones Aprobar y Rechazar</w:t>
             </w:r>
           </w:p>
         </w:tc>
         <w:tc>
           <w:tcPr>
             <w:tcW w:w="2831" w:type="dxa"/>
-            <w:tcMar>
-              <w:top w:w="50" w:type="dxa"/>
-              <w:left w:w="90" w:type="dxa"/>
-              <w:bottom w:w="50" w:type="dxa"/>
-              <w:right w:w="90" w:type="dxa"/>
-            </w:tcMar>
-          </w:tcPr>
-          <w:p>
-            <w:pPr>
-              <w:spacing w:after="0" w:line="250" w:lineRule="auto"/>
-              <w:jc w:val="left"/>
-            </w:pPr>
-            <w:r>
-              <w:rPr>
-                <w:sz w:val="19"/>
-              </w:rPr>
-              <w:t>4.12 Consultar los reportes</w:t>
+            <w:tcBorders>
+              <w:bottom w:val="single" w:sz="4" w:space="0" w:color="A6A6A6"/>
+            </w:tcBorders>
+            <w:shd w:val="clear" w:color="auto" w:fill="auto"/>
+            <w:tcMar>
+              <w:top w:w="50" w:type="dxa"/>
+              <w:left w:w="90" w:type="dxa"/>
+              <w:bottom w:w="50" w:type="dxa"/>
+              <w:right w:w="90" w:type="dxa"/>
+            </w:tcMar>
+          </w:tcPr>
+          <w:p>
+            <w:pPr>
+              <w:spacing w:after="0" w:line="250" w:lineRule="auto"/>
+              <w:jc w:val="left"/>
+            </w:pPr>
+            <w:r>
+              <w:rPr>
+                <w:sz w:val="19"/>
+              </w:rPr>
+              <w:t>4.11 Alertas de reposición y órdenes de compra</w:t>
             </w:r>
           </w:p>
         </w:tc>
@@ -10712,6 +11360,9 @@
         <w:tc>
           <w:tcPr>
             <w:tcW w:w="830" w:type="dxa"/>
+            <w:tcBorders>
+              <w:bottom w:val="single" w:sz="4" w:space="0" w:color="A6A6A6"/>
+            </w:tcBorders>
             <w:shd w:val="clear" w:color="auto" w:fill="F2F2F2"/>
             <w:tcMar>
               <w:top w:w="50" w:type="dxa"/>
@@ -10729,13 +11380,16 @@
               <w:rPr>
                 <w:sz w:val="19"/>
               </w:rPr>
-              <w:t>4.13.1</w:t>
+              <w:t>4.12.1</w:t>
             </w:r>
           </w:p>
         </w:tc>
         <w:tc>
           <w:tcPr>
             <w:tcW w:w="1761" w:type="dxa"/>
+            <w:tcBorders>
+              <w:bottom w:val="single" w:sz="4" w:space="0" w:color="A6A6A6"/>
+            </w:tcBorders>
             <w:shd w:val="clear" w:color="auto" w:fill="F2F2F2"/>
             <w:tcMar>
               <w:top w:w="50" w:type="dxa"/>
@@ -10753,13 +11407,16 @@
               <w:rPr>
                 <w:sz w:val="19"/>
               </w:rPr>
-              <w:t>Mermas</w:t>
+              <w:t>Reportes</w:t>
             </w:r>
           </w:p>
         </w:tc>
         <w:tc>
           <w:tcPr>
             <w:tcW w:w="4318" w:type="dxa"/>
+            <w:tcBorders>
+              <w:bottom w:val="single" w:sz="4" w:space="0" w:color="A6A6A6"/>
+            </w:tcBorders>
             <w:shd w:val="clear" w:color="auto" w:fill="F2F2F2"/>
             <w:tcMar>
               <w:top w:w="50" w:type="dxa"/>
@@ -10777,13 +11434,16 @@
               <w:rPr>
                 <w:sz w:val="19"/>
               </w:rPr>
-              <w:t>Menú Exportar con las opciones Exportar PDF y Exportar Excel</w:t>
+              <w:t>Indicadores comparados con el período anterior y el gráfico de ventas del período</w:t>
             </w:r>
           </w:p>
         </w:tc>
         <w:tc>
           <w:tcPr>
             <w:tcW w:w="2831" w:type="dxa"/>
+            <w:tcBorders>
+              <w:bottom w:val="single" w:sz="4" w:space="0" w:color="A6A6A6"/>
+            </w:tcBorders>
             <w:shd w:val="clear" w:color="auto" w:fill="F2F2F2"/>
             <w:tcMar>
               <w:top w:w="50" w:type="dxa"/>
@@ -10801,7 +11461,7 @@
               <w:rPr>
                 <w:sz w:val="19"/>
               </w:rPr>
-              <w:t>4.13 Exportar a PDF y a Excel</w:t>
+              <w:t>4.12 Consultar los reportes</w:t>
             </w:r>
           </w:p>
         </w:tc>
@@ -10813,92 +11473,108 @@
         <w:tc>
           <w:tcPr>
             <w:tcW w:w="830" w:type="dxa"/>
-            <w:tcMar>
-              <w:top w:w="50" w:type="dxa"/>
-              <w:left w:w="90" w:type="dxa"/>
-              <w:bottom w:w="50" w:type="dxa"/>
-              <w:right w:w="90" w:type="dxa"/>
-            </w:tcMar>
-          </w:tcPr>
-          <w:p>
-            <w:pPr>
-              <w:spacing w:after="0" w:line="250" w:lineRule="auto"/>
-              <w:jc w:val="left"/>
-            </w:pPr>
-            <w:r>
-              <w:rPr>
-                <w:sz w:val="19"/>
-              </w:rPr>
-              <w:t>4.14.1</w:t>
+            <w:tcBorders>
+              <w:bottom w:val="single" w:sz="4" w:space="0" w:color="A6A6A6"/>
+            </w:tcBorders>
+            <w:shd w:val="clear" w:color="auto" w:fill="auto"/>
+            <w:tcMar>
+              <w:top w:w="50" w:type="dxa"/>
+              <w:left w:w="90" w:type="dxa"/>
+              <w:bottom w:w="50" w:type="dxa"/>
+              <w:right w:w="90" w:type="dxa"/>
+            </w:tcMar>
+          </w:tcPr>
+          <w:p>
+            <w:pPr>
+              <w:spacing w:after="0" w:line="250" w:lineRule="auto"/>
+              <w:jc w:val="left"/>
+            </w:pPr>
+            <w:r>
+              <w:rPr>
+                <w:sz w:val="19"/>
+              </w:rPr>
+              <w:t>4.13.1</w:t>
             </w:r>
           </w:p>
         </w:tc>
         <w:tc>
           <w:tcPr>
             <w:tcW w:w="1761" w:type="dxa"/>
-            <w:tcMar>
-              <w:top w:w="50" w:type="dxa"/>
-              <w:left w:w="90" w:type="dxa"/>
-              <w:bottom w:w="50" w:type="dxa"/>
-              <w:right w:w="90" w:type="dxa"/>
-            </w:tcMar>
-          </w:tcPr>
-          <w:p>
-            <w:pPr>
-              <w:spacing w:after="0" w:line="250" w:lineRule="auto"/>
-              <w:jc w:val="left"/>
-            </w:pPr>
-            <w:r>
-              <w:rPr>
-                <w:sz w:val="19"/>
-              </w:rPr>
-              <w:t>Negocio</w:t>
+            <w:tcBorders>
+              <w:bottom w:val="single" w:sz="4" w:space="0" w:color="A6A6A6"/>
+            </w:tcBorders>
+            <w:shd w:val="clear" w:color="auto" w:fill="auto"/>
+            <w:tcMar>
+              <w:top w:w="50" w:type="dxa"/>
+              <w:left w:w="90" w:type="dxa"/>
+              <w:bottom w:w="50" w:type="dxa"/>
+              <w:right w:w="90" w:type="dxa"/>
+            </w:tcMar>
+          </w:tcPr>
+          <w:p>
+            <w:pPr>
+              <w:spacing w:after="0" w:line="250" w:lineRule="auto"/>
+              <w:jc w:val="left"/>
+            </w:pPr>
+            <w:r>
+              <w:rPr>
+                <w:sz w:val="19"/>
+              </w:rPr>
+              <w:t>Mermas</w:t>
             </w:r>
           </w:p>
         </w:tc>
         <w:tc>
           <w:tcPr>
             <w:tcW w:w="4318" w:type="dxa"/>
-            <w:tcMar>
-              <w:top w:w="50" w:type="dxa"/>
-              <w:left w:w="90" w:type="dxa"/>
-              <w:bottom w:w="50" w:type="dxa"/>
-              <w:right w:w="90" w:type="dxa"/>
-            </w:tcMar>
-          </w:tcPr>
-          <w:p>
-            <w:pPr>
-              <w:spacing w:after="0" w:line="250" w:lineRule="auto"/>
-              <w:jc w:val="left"/>
-            </w:pPr>
-            <w:r>
-              <w:rPr>
-                <w:sz w:val="19"/>
-              </w:rPr>
-              <w:t>Datos del negocio para el comprobante</w:t>
+            <w:tcBorders>
+              <w:bottom w:val="single" w:sz="4" w:space="0" w:color="A6A6A6"/>
+            </w:tcBorders>
+            <w:shd w:val="clear" w:color="auto" w:fill="auto"/>
+            <w:tcMar>
+              <w:top w:w="50" w:type="dxa"/>
+              <w:left w:w="90" w:type="dxa"/>
+              <w:bottom w:w="50" w:type="dxa"/>
+              <w:right w:w="90" w:type="dxa"/>
+            </w:tcMar>
+          </w:tcPr>
+          <w:p>
+            <w:pPr>
+              <w:spacing w:after="0" w:line="250" w:lineRule="auto"/>
+              <w:jc w:val="left"/>
+            </w:pPr>
+            <w:r>
+              <w:rPr>
+                <w:sz w:val="19"/>
+              </w:rPr>
+              <w:t>Menú Exportar con las opciones Exportar PDF y Exportar Excel</w:t>
             </w:r>
           </w:p>
         </w:tc>
         <w:tc>
           <w:tcPr>
             <w:tcW w:w="2831" w:type="dxa"/>
-            <w:tcMar>
-              <w:top w:w="50" w:type="dxa"/>
-              <w:left w:w="90" w:type="dxa"/>
-              <w:bottom w:w="50" w:type="dxa"/>
-              <w:right w:w="90" w:type="dxa"/>
-            </w:tcMar>
-          </w:tcPr>
-          <w:p>
-            <w:pPr>
-              <w:spacing w:after="0" w:line="250" w:lineRule="auto"/>
-              <w:jc w:val="left"/>
-            </w:pPr>
-            <w:r>
-              <w:rPr>
-                <w:sz w:val="19"/>
-              </w:rPr>
-              <w:t>4.14 Configurar los datos del negocio</w:t>
+            <w:tcBorders>
+              <w:bottom w:val="single" w:sz="4" w:space="0" w:color="A6A6A6"/>
+            </w:tcBorders>
+            <w:shd w:val="clear" w:color="auto" w:fill="auto"/>
+            <w:tcMar>
+              <w:top w:w="50" w:type="dxa"/>
+              <w:left w:w="90" w:type="dxa"/>
+              <w:bottom w:w="50" w:type="dxa"/>
+              <w:right w:w="90" w:type="dxa"/>
+            </w:tcMar>
+          </w:tcPr>
+          <w:p>
+            <w:pPr>
+              <w:spacing w:after="0" w:line="250" w:lineRule="auto"/>
+              <w:jc w:val="left"/>
+            </w:pPr>
+            <w:r>
+              <w:rPr>
+                <w:sz w:val="19"/>
+              </w:rPr>
+              <w:t>4.13 Exportar a PDF y a Excel</w:t>
             </w:r>
           </w:p>
         </w:tc>
@@ -10910,6 +11586,9 @@
         <w:tc>
           <w:tcPr>
             <w:tcW w:w="830" w:type="dxa"/>
+            <w:tcBorders>
+              <w:bottom w:val="single" w:sz="4" w:space="0" w:color="A6A6A6"/>
+            </w:tcBorders>
             <w:shd w:val="clear" w:color="auto" w:fill="F2F2F2"/>
             <w:tcMar>
               <w:top w:w="50" w:type="dxa"/>
@@ -10927,6 +11606,116 @@
               <w:rPr>
                 <w:sz w:val="19"/>
               </w:rPr>
+              <w:t>4.14.1</w:t>
+            </w:r>
+          </w:p>
+        </w:tc>
+        <w:tc>
+          <w:tcPr>
+            <w:tcW w:w="1761" w:type="dxa"/>
+            <w:tcBorders>
+              <w:bottom w:val="single" w:sz="4" w:space="0" w:color="A6A6A6"/>
+            </w:tcBorders>
+            <w:shd w:val="clear" w:color="auto" w:fill="F2F2F2"/>
+            <w:tcMar>
+              <w:top w:w="50" w:type="dxa"/>
+              <w:left w:w="90" w:type="dxa"/>
+              <w:bottom w:w="50" w:type="dxa"/>
+              <w:right w:w="90" w:type="dxa"/>
+            </w:tcMar>
+          </w:tcPr>
+          <w:p>
+            <w:pPr>
+              <w:spacing w:after="0" w:line="250" w:lineRule="auto"/>
+              <w:jc w:val="left"/>
+            </w:pPr>
+            <w:r>
+              <w:rPr>
+                <w:sz w:val="19"/>
+              </w:rPr>
+              <w:t>Negocio</w:t>
+            </w:r>
+          </w:p>
+        </w:tc>
+        <w:tc>
+          <w:tcPr>
+            <w:tcW w:w="4318" w:type="dxa"/>
+            <w:tcBorders>
+              <w:bottom w:val="single" w:sz="4" w:space="0" w:color="A6A6A6"/>
+            </w:tcBorders>
+            <w:shd w:val="clear" w:color="auto" w:fill="F2F2F2"/>
+            <w:tcMar>
+              <w:top w:w="50" w:type="dxa"/>
+              <w:left w:w="90" w:type="dxa"/>
+              <w:bottom w:w="50" w:type="dxa"/>
+              <w:right w:w="90" w:type="dxa"/>
+            </w:tcMar>
+          </w:tcPr>
+          <w:p>
+            <w:pPr>
+              <w:spacing w:after="0" w:line="250" w:lineRule="auto"/>
+              <w:jc w:val="left"/>
+            </w:pPr>
+            <w:r>
+              <w:rPr>
+                <w:sz w:val="19"/>
+              </w:rPr>
+              <w:t>Datos del negocio para el comprobante</w:t>
+            </w:r>
+          </w:p>
+        </w:tc>
+        <w:tc>
+          <w:tcPr>
+            <w:tcW w:w="2831" w:type="dxa"/>
+            <w:tcBorders>
+              <w:bottom w:val="single" w:sz="4" w:space="0" w:color="A6A6A6"/>
+            </w:tcBorders>
+            <w:shd w:val="clear" w:color="auto" w:fill="F2F2F2"/>
+            <w:tcMar>
+              <w:top w:w="50" w:type="dxa"/>
+              <w:left w:w="90" w:type="dxa"/>
+              <w:bottom w:w="50" w:type="dxa"/>
+              <w:right w:w="90" w:type="dxa"/>
+            </w:tcMar>
+          </w:tcPr>
+          <w:p>
+            <w:pPr>
+              <w:spacing w:after="0" w:line="250" w:lineRule="auto"/>
+              <w:jc w:val="left"/>
+            </w:pPr>
+            <w:r>
+              <w:rPr>
+                <w:sz w:val="19"/>
+              </w:rPr>
+              <w:t>4.14 Configurar los datos del negocio</w:t>
+            </w:r>
+          </w:p>
+        </w:tc>
+      </w:tr>
+      <w:tr>
+        <w:trPr>
+          <w:cantSplit/>
+        </w:trPr>
+        <w:tc>
+          <w:tcPr>
+            <w:tcW w:w="830" w:type="dxa"/>
+            <w:shd w:val="clear" w:color="auto" w:fill="auto"/>
+            <w:tcMar>
+              <w:top w:w="50" w:type="dxa"/>
+              <w:left w:w="90" w:type="dxa"/>
+              <w:bottom w:w="50" w:type="dxa"/>
+              <w:right w:w="90" w:type="dxa"/>
+            </w:tcMar>
+          </w:tcPr>
+          <w:p>
+            <w:pPr>
+              <w:spacing w:after="0" w:line="250" w:lineRule="auto"/>
+              <w:jc w:val="left"/>
+            </w:pPr>
+            <w:r>
+              <w:rPr>
+                <w:sz w:val="19"/>
+              </w:rPr>
               <w:t>4.15.1</w:t>
             </w:r>
           </w:p>
@@ -10934,7 +11723,7 @@
         <w:tc>
           <w:tcPr>
             <w:tcW w:w="1761" w:type="dxa"/>
-            <w:shd w:val="clear" w:color="auto" w:fill="F2F2F2"/>
+            <w:shd w:val="clear" w:color="auto" w:fill="auto"/>
             <w:tcMar>
               <w:top w:w="50" w:type="dxa"/>
               <w:left w:w="90" w:type="dxa"/>
@@ -10958,7 +11747,7 @@
         <w:tc>
           <w:tcPr>
             <w:tcW w:w="4318" w:type="dxa"/>
-            <w:shd w:val="clear" w:color="auto" w:fill="F2F2F2"/>
+            <w:shd w:val="clear" w:color="auto" w:fill="auto"/>
             <w:tcMar>
               <w:top w:w="50" w:type="dxa"/>
               <w:left w:w="90" w:type="dxa"/>
@@ -10982,7 +11771,7 @@
         <w:tc>
           <w:tcPr>
             <w:tcW w:w="2831" w:type="dxa"/>
-            <w:shd w:val="clear" w:color="auto" w:fill="F2F2F2"/>
+            <w:shd w:val="clear" w:color="auto" w:fill="auto"/>
             <w:tcMar>
               <w:top w:w="50" w:type="dxa"/>
               <w:left w:w="90" w:type="dxa"/>

</xml_diff>

<commit_message>
Corrige la advertencia de claves del manual y el texto de Caja (corrida 11)
</commit_message>
<xml_diff>
--- a/docs/manuales/Manual_Administrador.docx
+++ b/docs/manuales/Manual_Administrador.docx
@@ -4935,7 +4935,10 @@
         <w:t>Advertencia:</w:t>
       </w:r>
       <w:r>
-        <w:t xml:space="preserve"> no puede quitarse el rol de administrador ni desactivarse a sí mismo, y siempre debe quedar al menos un administrador activo. Las claves se guardan sin cifrar en la base de datos: no use claves personales que se repitan en otros servicios.</w:t>
+        <w:t xml:space="preserve"> no puede quitarse el rol de administrador ni desactivarse a sí mismo, y siempre debe quedar al menos un administrador activo. </w:t>
+      </w:r>
+      <w:r>
+        <w:t>Desde OBS-06 las claves se guardan cifradas (hash PBKDF2 con sal): nadie puede leerlas en la base de datos ni en sus respaldos, ni siquiera el administrador. El administrador puede restablecer la clave de un usuario, pero no ver la que tenía.</w:t>
       </w:r>
     </w:p>
     <w:p>

</xml_diff>